<commit_message>
Improve opening times section
</commit_message>
<xml_diff>
--- a/20061275.docx
+++ b/20061275.docx
@@ -45,7 +45,14 @@
       </w:r>
       <w:r>
         <w:br/>
-        <w:t>WildHeart Eco Park</w:t>
+      </w:r>
+      <w:proofErr w:type="spellStart"/>
+      <w:r>
+        <w:t>WildHeart</w:t>
+      </w:r>
+      <w:proofErr w:type="spellEnd"/>
+      <w:r>
+        <w:t xml:space="preserve"> Eco Park</w:t>
       </w:r>
       <w:r>
         <w:br/>
@@ -60,12 +67,22 @@
       </w:r>
       <w:r>
         <w:br/>
-        <w:t>[ Explore Habitats ]</w:t>
-      </w:r>
-      <w:r>
-        <w:br/>
-        <w:t>[ Book Tickets ]</w:t>
-      </w:r>
+        <w:t xml:space="preserve">[ Explore </w:t>
+      </w:r>
+      <w:proofErr w:type="gramStart"/>
+      <w:r>
+        <w:t>Habitats ]</w:t>
+      </w:r>
+      <w:proofErr w:type="gramEnd"/>
+      <w:r>
+        <w:br/>
+        <w:t xml:space="preserve">[ Book </w:t>
+      </w:r>
+      <w:proofErr w:type="gramStart"/>
+      <w:r>
+        <w:t>Tickets ]</w:t>
+      </w:r>
+      <w:proofErr w:type="gramEnd"/>
       <w:r>
         <w:br/>
       </w:r>
@@ -103,8 +120,13 @@
       </w:r>
       <w:r>
         <w:br/>
-        <w:t>[ Animated habitat cards... ]</w:t>
-      </w:r>
+        <w:t>[ Animated habitat cards</w:t>
+      </w:r>
+      <w:proofErr w:type="gramStart"/>
+      <w:r>
+        <w:t>... ]</w:t>
+      </w:r>
+      <w:proofErr w:type="gramEnd"/>
     </w:p>
     <w:p/>
     <w:p/>
@@ -113,8 +135,13 @@
       <w:pPr>
         <w:pStyle w:val="pdq2pgselectionanchorcontainer"/>
       </w:pPr>
-      <w:r>
-        <w:t>FaQ:</w:t>
+      <w:proofErr w:type="spellStart"/>
+      <w:r>
+        <w:t>FaQ</w:t>
+      </w:r>
+      <w:proofErr w:type="spellEnd"/>
+      <w:r>
+        <w:t>:</w:t>
       </w:r>
       <w:r>
         <w:br/>
@@ -190,7 +217,31 @@
           <w14:ligatures w14:val="none"/>
         </w:rPr>
         <w:br/>
-        <w:t>Question                    [Photo of giraffe]</w:t>
+        <w:t xml:space="preserve">Question                 </w:t>
+      </w:r>
+      <w:proofErr w:type="gramStart"/>
+      <w:r>
+        <w:rPr>
+          <w:rFonts w:ascii="Courier New" w:eastAsia="Times New Roman" w:hAnsi="Courier New" w:cs="Courier New"/>
+          <w:kern w:val="0"/>
+          <w:sz w:val="20"/>
+          <w:szCs w:val="20"/>
+          <w:lang w:eastAsia="en-GB"/>
+          <w14:ligatures w14:val="none"/>
+        </w:rPr>
+        <w:t xml:space="preserve">   [</w:t>
+      </w:r>
+      <w:proofErr w:type="gramEnd"/>
+      <w:r>
+        <w:rPr>
+          <w:rFonts w:ascii="Courier New" w:eastAsia="Times New Roman" w:hAnsi="Courier New" w:cs="Courier New"/>
+          <w:kern w:val="0"/>
+          <w:sz w:val="20"/>
+          <w:szCs w:val="20"/>
+          <w:lang w:eastAsia="en-GB"/>
+          <w14:ligatures w14:val="none"/>
+        </w:rPr>
+        <w:t>Photo of giraffe]</w:t>
       </w:r>
       <w:r>
         <w:rPr>
@@ -248,7 +299,31 @@
           <w14:ligatures w14:val="none"/>
         </w:rPr>
         <w:br/>
-        <w:t xml:space="preserve">                     [Discover More]</w:t>
+        <w:t xml:space="preserve">                  </w:t>
+      </w:r>
+      <w:proofErr w:type="gramStart"/>
+      <w:r>
+        <w:rPr>
+          <w:rFonts w:ascii="Courier New" w:eastAsia="Times New Roman" w:hAnsi="Courier New" w:cs="Courier New"/>
+          <w:kern w:val="0"/>
+          <w:sz w:val="20"/>
+          <w:szCs w:val="20"/>
+          <w:lang w:eastAsia="en-GB"/>
+          <w14:ligatures w14:val="none"/>
+        </w:rPr>
+        <w:t xml:space="preserve">   [</w:t>
+      </w:r>
+      <w:proofErr w:type="gramEnd"/>
+      <w:r>
+        <w:rPr>
+          <w:rFonts w:ascii="Courier New" w:eastAsia="Times New Roman" w:hAnsi="Courier New" w:cs="Courier New"/>
+          <w:kern w:val="0"/>
+          <w:sz w:val="20"/>
+          <w:szCs w:val="20"/>
+          <w:lang w:eastAsia="en-GB"/>
+          <w14:ligatures w14:val="none"/>
+        </w:rPr>
+        <w:t>Discover More]</w:t>
       </w:r>
       <w:r>
         <w:rPr>
@@ -375,7 +450,31 @@
           <w14:ligatures w14:val="none"/>
         </w:rPr>
         <w:br/>
-        <w:t>Question                    [Car park photo]</w:t>
+        <w:t xml:space="preserve">Question                 </w:t>
+      </w:r>
+      <w:proofErr w:type="gramStart"/>
+      <w:r>
+        <w:rPr>
+          <w:rFonts w:ascii="Courier New" w:eastAsia="Times New Roman" w:hAnsi="Courier New" w:cs="Courier New"/>
+          <w:kern w:val="0"/>
+          <w:sz w:val="20"/>
+          <w:szCs w:val="20"/>
+          <w:lang w:eastAsia="en-GB"/>
+          <w14:ligatures w14:val="none"/>
+        </w:rPr>
+        <w:t xml:space="preserve">   [</w:t>
+      </w:r>
+      <w:proofErr w:type="gramEnd"/>
+      <w:r>
+        <w:rPr>
+          <w:rFonts w:ascii="Courier New" w:eastAsia="Times New Roman" w:hAnsi="Courier New" w:cs="Courier New"/>
+          <w:kern w:val="0"/>
+          <w:sz w:val="20"/>
+          <w:szCs w:val="20"/>
+          <w:lang w:eastAsia="en-GB"/>
+          <w14:ligatures w14:val="none"/>
+        </w:rPr>
+        <w:t>Car park photo]</w:t>
       </w:r>
       <w:r>
         <w:rPr>
@@ -421,7 +520,31 @@
           <w14:ligatures w14:val="none"/>
         </w:rPr>
         <w:br/>
-        <w:t xml:space="preserve">                     [Map]</w:t>
+        <w:t xml:space="preserve">                  </w:t>
+      </w:r>
+      <w:proofErr w:type="gramStart"/>
+      <w:r>
+        <w:rPr>
+          <w:rFonts w:ascii="Courier New" w:eastAsia="Times New Roman" w:hAnsi="Courier New" w:cs="Courier New"/>
+          <w:kern w:val="0"/>
+          <w:sz w:val="20"/>
+          <w:szCs w:val="20"/>
+          <w:lang w:eastAsia="en-GB"/>
+          <w14:ligatures w14:val="none"/>
+        </w:rPr>
+        <w:t xml:space="preserve">   [</w:t>
+      </w:r>
+      <w:proofErr w:type="gramEnd"/>
+      <w:r>
+        <w:rPr>
+          <w:rFonts w:ascii="Courier New" w:eastAsia="Times New Roman" w:hAnsi="Courier New" w:cs="Courier New"/>
+          <w:kern w:val="0"/>
+          <w:sz w:val="20"/>
+          <w:szCs w:val="20"/>
+          <w:lang w:eastAsia="en-GB"/>
+          <w14:ligatures w14:val="none"/>
+        </w:rPr>
+        <w:t>Map]</w:t>
       </w:r>
       <w:r>
         <w:rPr>
@@ -527,53 +650,124 @@
           <w14:ligatures w14:val="none"/>
         </w:rPr>
         <w:br/>
-        <w:t>Question                    [Lion or ranger]</w:t>
-      </w:r>
-      <w:r>
-        <w:rPr>
-          <w:rFonts w:ascii="Courier New" w:eastAsia="Times New Roman" w:hAnsi="Courier New" w:cs="Courier New"/>
-          <w:kern w:val="0"/>
-          <w:sz w:val="20"/>
-          <w:szCs w:val="20"/>
-          <w:lang w:eastAsia="en-GB"/>
-          <w14:ligatures w14:val="none"/>
-        </w:rPr>
-        <w:br/>
-      </w:r>
-      <w:r>
-        <w:rPr>
-          <w:rFonts w:ascii="Courier New" w:eastAsia="Times New Roman" w:hAnsi="Courier New" w:cs="Courier New"/>
-          <w:kern w:val="0"/>
-          <w:sz w:val="20"/>
-          <w:szCs w:val="20"/>
-          <w:lang w:eastAsia="en-GB"/>
-          <w14:ligatures w14:val="none"/>
-        </w:rPr>
-        <w:br/>
-        <w:t>WildHeart Eco Park supports...</w:t>
-      </w:r>
-      <w:r>
-        <w:rPr>
-          <w:rFonts w:ascii="Courier New" w:eastAsia="Times New Roman" w:hAnsi="Courier New" w:cs="Courier New"/>
-          <w:kern w:val="0"/>
-          <w:sz w:val="20"/>
-          <w:szCs w:val="20"/>
-          <w:lang w:eastAsia="en-GB"/>
-          <w14:ligatures w14:val="none"/>
-        </w:rPr>
-        <w:br/>
-      </w:r>
-      <w:r>
-        <w:rPr>
-          <w:rFonts w:ascii="Courier New" w:eastAsia="Times New Roman" w:hAnsi="Courier New" w:cs="Courier New"/>
-          <w:kern w:val="0"/>
-          <w:sz w:val="20"/>
-          <w:szCs w:val="20"/>
-          <w:lang w:eastAsia="en-GB"/>
-          <w14:ligatures w14:val="none"/>
-        </w:rPr>
-        <w:br/>
-        <w:t xml:space="preserve">               [Conservation]</w:t>
+        <w:t xml:space="preserve">Question                 </w:t>
+      </w:r>
+      <w:proofErr w:type="gramStart"/>
+      <w:r>
+        <w:rPr>
+          <w:rFonts w:ascii="Courier New" w:eastAsia="Times New Roman" w:hAnsi="Courier New" w:cs="Courier New"/>
+          <w:kern w:val="0"/>
+          <w:sz w:val="20"/>
+          <w:szCs w:val="20"/>
+          <w:lang w:eastAsia="en-GB"/>
+          <w14:ligatures w14:val="none"/>
+        </w:rPr>
+        <w:t xml:space="preserve">   [</w:t>
+      </w:r>
+      <w:proofErr w:type="gramEnd"/>
+      <w:r>
+        <w:rPr>
+          <w:rFonts w:ascii="Courier New" w:eastAsia="Times New Roman" w:hAnsi="Courier New" w:cs="Courier New"/>
+          <w:kern w:val="0"/>
+          <w:sz w:val="20"/>
+          <w:szCs w:val="20"/>
+          <w:lang w:eastAsia="en-GB"/>
+          <w14:ligatures w14:val="none"/>
+        </w:rPr>
+        <w:t>Lion or ranger]</w:t>
+      </w:r>
+      <w:r>
+        <w:rPr>
+          <w:rFonts w:ascii="Courier New" w:eastAsia="Times New Roman" w:hAnsi="Courier New" w:cs="Courier New"/>
+          <w:kern w:val="0"/>
+          <w:sz w:val="20"/>
+          <w:szCs w:val="20"/>
+          <w:lang w:eastAsia="en-GB"/>
+          <w14:ligatures w14:val="none"/>
+        </w:rPr>
+        <w:br/>
+      </w:r>
+      <w:r>
+        <w:rPr>
+          <w:rFonts w:ascii="Courier New" w:eastAsia="Times New Roman" w:hAnsi="Courier New" w:cs="Courier New"/>
+          <w:kern w:val="0"/>
+          <w:sz w:val="20"/>
+          <w:szCs w:val="20"/>
+          <w:lang w:eastAsia="en-GB"/>
+          <w14:ligatures w14:val="none"/>
+        </w:rPr>
+        <w:br/>
+      </w:r>
+      <w:proofErr w:type="spellStart"/>
+      <w:r>
+        <w:rPr>
+          <w:rFonts w:ascii="Courier New" w:eastAsia="Times New Roman" w:hAnsi="Courier New" w:cs="Courier New"/>
+          <w:kern w:val="0"/>
+          <w:sz w:val="20"/>
+          <w:szCs w:val="20"/>
+          <w:lang w:eastAsia="en-GB"/>
+          <w14:ligatures w14:val="none"/>
+        </w:rPr>
+        <w:t>WildHeart</w:t>
+      </w:r>
+      <w:proofErr w:type="spellEnd"/>
+      <w:r>
+        <w:rPr>
+          <w:rFonts w:ascii="Courier New" w:eastAsia="Times New Roman" w:hAnsi="Courier New" w:cs="Courier New"/>
+          <w:kern w:val="0"/>
+          <w:sz w:val="20"/>
+          <w:szCs w:val="20"/>
+          <w:lang w:eastAsia="en-GB"/>
+          <w14:ligatures w14:val="none"/>
+        </w:rPr>
+        <w:t xml:space="preserve"> Eco Park supports...</w:t>
+      </w:r>
+      <w:r>
+        <w:rPr>
+          <w:rFonts w:ascii="Courier New" w:eastAsia="Times New Roman" w:hAnsi="Courier New" w:cs="Courier New"/>
+          <w:kern w:val="0"/>
+          <w:sz w:val="20"/>
+          <w:szCs w:val="20"/>
+          <w:lang w:eastAsia="en-GB"/>
+          <w14:ligatures w14:val="none"/>
+        </w:rPr>
+        <w:br/>
+      </w:r>
+      <w:r>
+        <w:rPr>
+          <w:rFonts w:ascii="Courier New" w:eastAsia="Times New Roman" w:hAnsi="Courier New" w:cs="Courier New"/>
+          <w:kern w:val="0"/>
+          <w:sz w:val="20"/>
+          <w:szCs w:val="20"/>
+          <w:lang w:eastAsia="en-GB"/>
+          <w14:ligatures w14:val="none"/>
+        </w:rPr>
+        <w:br/>
+        <w:t xml:space="preserve">            </w:t>
+      </w:r>
+      <w:proofErr w:type="gramStart"/>
+      <w:r>
+        <w:rPr>
+          <w:rFonts w:ascii="Courier New" w:eastAsia="Times New Roman" w:hAnsi="Courier New" w:cs="Courier New"/>
+          <w:kern w:val="0"/>
+          <w:sz w:val="20"/>
+          <w:szCs w:val="20"/>
+          <w:lang w:eastAsia="en-GB"/>
+          <w14:ligatures w14:val="none"/>
+        </w:rPr>
+        <w:t xml:space="preserve">   [</w:t>
+      </w:r>
+      <w:proofErr w:type="gramEnd"/>
+      <w:r>
+        <w:rPr>
+          <w:rFonts w:ascii="Courier New" w:eastAsia="Times New Roman" w:hAnsi="Courier New" w:cs="Courier New"/>
+          <w:kern w:val="0"/>
+          <w:sz w:val="20"/>
+          <w:szCs w:val="20"/>
+          <w:lang w:eastAsia="en-GB"/>
+          <w14:ligatures w14:val="none"/>
+        </w:rPr>
+        <w:t>Conservation]</w:t>
       </w:r>
       <w:r>
         <w:rPr>
@@ -640,7 +834,27 @@
           <w:lang w:eastAsia="en-GB"/>
           <w14:ligatures w14:val="none"/>
         </w:rPr>
-        <w:t>During the development of the WildHeart Eco Park website, I created a modern, interactive, and user-friendly homepage using HTML, CSS, and JavaScript. The website was designed to provide visitors with an engaging experience while showcasing the park's attractions and conservation message.</w:t>
+        <w:t xml:space="preserve">During the development of the </w:t>
+      </w:r>
+      <w:proofErr w:type="spellStart"/>
+      <w:r>
+        <w:rPr>
+          <w:rFonts w:ascii="Times New Roman" w:eastAsia="Times New Roman" w:hAnsi="Times New Roman" w:cs="Times New Roman"/>
+          <w:kern w:val="0"/>
+          <w:lang w:eastAsia="en-GB"/>
+          <w14:ligatures w14:val="none"/>
+        </w:rPr>
+        <w:t>WildHeart</w:t>
+      </w:r>
+      <w:proofErr w:type="spellEnd"/>
+      <w:r>
+        <w:rPr>
+          <w:rFonts w:ascii="Times New Roman" w:eastAsia="Times New Roman" w:hAnsi="Times New Roman" w:cs="Times New Roman"/>
+          <w:kern w:val="0"/>
+          <w:lang w:eastAsia="en-GB"/>
+          <w14:ligatures w14:val="none"/>
+        </w:rPr>
+        <w:t xml:space="preserve"> Eco Park website, I created a modern, interactive, and user-friendly homepage using HTML, CSS, and JavaScript. The website was designed to provide visitors with an engaging experience while showcasing the park's attractions and conservation message.</w:t>
       </w:r>
     </w:p>
     <w:p>
@@ -680,7 +894,27 @@
           <w:lang w:eastAsia="en-GB"/>
           <w14:ligatures w14:val="none"/>
         </w:rPr>
-        <w:t xml:space="preserve">A large animated hero banner was added to the top of the homepage. Instead of using a static image, I converted the park's promotional artwork into a looping MP4 video. The video was embedded using the HTML </w:t>
+        <w:t xml:space="preserve">A </w:t>
+      </w:r>
+      <w:proofErr w:type="gramStart"/>
+      <w:r>
+        <w:rPr>
+          <w:rFonts w:ascii="Times New Roman" w:eastAsia="Times New Roman" w:hAnsi="Times New Roman" w:cs="Times New Roman"/>
+          <w:kern w:val="0"/>
+          <w:lang w:eastAsia="en-GB"/>
+          <w14:ligatures w14:val="none"/>
+        </w:rPr>
+        <w:t>large animated</w:t>
+      </w:r>
+      <w:proofErr w:type="gramEnd"/>
+      <w:r>
+        <w:rPr>
+          <w:rFonts w:ascii="Times New Roman" w:eastAsia="Times New Roman" w:hAnsi="Times New Roman" w:cs="Times New Roman"/>
+          <w:kern w:val="0"/>
+          <w:lang w:eastAsia="en-GB"/>
+          <w14:ligatures w14:val="none"/>
+        </w:rPr>
+        <w:t xml:space="preserve"> hero banner was added to the top of the homepage. Instead of using a static image, I converted the park's promotional artwork into a looping MP4 video. The video was embedded using the HTML </w:t>
       </w:r>
       <w:r>
         <w:rPr>
@@ -700,7 +934,27 @@
           <w:lang w:eastAsia="en-GB"/>
           <w14:ligatures w14:val="none"/>
         </w:rPr>
-        <w:t xml:space="preserve"> element with autoplay, muted, loop, and playsinline attributes to create a smooth and continuous animation. Custom CSS was used to ensure the video filled the entire header area while maintaining its proportions.</w:t>
+        <w:t xml:space="preserve"> element with autoplay, muted, loop, and </w:t>
+      </w:r>
+      <w:proofErr w:type="spellStart"/>
+      <w:r>
+        <w:rPr>
+          <w:rFonts w:ascii="Times New Roman" w:eastAsia="Times New Roman" w:hAnsi="Times New Roman" w:cs="Times New Roman"/>
+          <w:kern w:val="0"/>
+          <w:lang w:eastAsia="en-GB"/>
+          <w14:ligatures w14:val="none"/>
+        </w:rPr>
+        <w:t>playsinline</w:t>
+      </w:r>
+      <w:proofErr w:type="spellEnd"/>
+      <w:r>
+        <w:rPr>
+          <w:rFonts w:ascii="Times New Roman" w:eastAsia="Times New Roman" w:hAnsi="Times New Roman" w:cs="Times New Roman"/>
+          <w:kern w:val="0"/>
+          <w:lang w:eastAsia="en-GB"/>
+          <w14:ligatures w14:val="none"/>
+        </w:rPr>
+        <w:t xml:space="preserve"> attributes to create a smooth and continuous animation. Custom CSS was used to ensure the video filled the entire header area while maintaining its proportions.</w:t>
       </w:r>
     </w:p>
     <w:p>
@@ -740,7 +994,27 @@
           <w:lang w:eastAsia="en-GB"/>
           <w14:ligatures w14:val="none"/>
         </w:rPr>
-        <w:t>The website includes four themed habitats: Canopy of the Amazons, Guardians of the Savannah, Reptile Realm, and Coral Cove. Short animated videos were created for each habitat to make the page more dynamic and visually engaging.</w:t>
+        <w:t xml:space="preserve">The website includes four themed habitats: Canopy of the Amazons, Guardians of the Savannah, Reptile Realm, and Coral Cove. </w:t>
+      </w:r>
+      <w:proofErr w:type="gramStart"/>
+      <w:r>
+        <w:rPr>
+          <w:rFonts w:ascii="Times New Roman" w:eastAsia="Times New Roman" w:hAnsi="Times New Roman" w:cs="Times New Roman"/>
+          <w:kern w:val="0"/>
+          <w:lang w:eastAsia="en-GB"/>
+          <w14:ligatures w14:val="none"/>
+        </w:rPr>
+        <w:t>Short animated</w:t>
+      </w:r>
+      <w:proofErr w:type="gramEnd"/>
+      <w:r>
+        <w:rPr>
+          <w:rFonts w:ascii="Times New Roman" w:eastAsia="Times New Roman" w:hAnsi="Times New Roman" w:cs="Times New Roman"/>
+          <w:kern w:val="0"/>
+          <w:lang w:eastAsia="en-GB"/>
+          <w14:ligatures w14:val="none"/>
+        </w:rPr>
+        <w:t xml:space="preserve"> videos were created for each habitat to make the page more dynamic and visually engaging.</w:t>
       </w:r>
     </w:p>
     <w:p>
@@ -820,10 +1094,551 @@
           <w:lang w:eastAsia="en-GB"/>
           <w14:ligatures w14:val="none"/>
         </w:rPr>
-        <w:t>Overall, the website has progressed from a simple HTML page into a responsive, visually attractive, and interactive website that combines multimedia content, animation, JavaScript functionality, and consistent styling to provide an engaging experience for visitors to WildHeart Eco Park.</w:t>
+        <w:t xml:space="preserve">Overall, the website has progressed from a simple HTML page into a responsive, visually attractive, and interactive website that combines multimedia content, animation, JavaScript functionality, and consistent styling to provide an engaging experience for visitors to </w:t>
+      </w:r>
+      <w:proofErr w:type="spellStart"/>
+      <w:r>
+        <w:rPr>
+          <w:rFonts w:ascii="Times New Roman" w:eastAsia="Times New Roman" w:hAnsi="Times New Roman" w:cs="Times New Roman"/>
+          <w:kern w:val="0"/>
+          <w:lang w:eastAsia="en-GB"/>
+          <w14:ligatures w14:val="none"/>
+        </w:rPr>
+        <w:t>WildHeart</w:t>
+      </w:r>
+      <w:proofErr w:type="spellEnd"/>
+      <w:r>
+        <w:rPr>
+          <w:rFonts w:ascii="Times New Roman" w:eastAsia="Times New Roman" w:hAnsi="Times New Roman" w:cs="Times New Roman"/>
+          <w:kern w:val="0"/>
+          <w:lang w:eastAsia="en-GB"/>
+          <w14:ligatures w14:val="none"/>
+        </w:rPr>
+        <w:t xml:space="preserve"> Eco Park.</w:t>
+      </w:r>
+    </w:p>
+    <w:p>
+      <w:pPr>
+        <w:rPr>
+          <w:rFonts w:ascii="Times New Roman" w:eastAsia="Times New Roman" w:hAnsi="Times New Roman" w:cs="Times New Roman"/>
+          <w:kern w:val="0"/>
+          <w:lang w:eastAsia="en-GB"/>
+          <w14:ligatures w14:val="none"/>
+        </w:rPr>
+      </w:pPr>
+      <w:r>
+        <w:rPr>
+          <w:rFonts w:ascii="Times New Roman" w:eastAsia="Times New Roman" w:hAnsi="Times New Roman" w:cs="Times New Roman"/>
+          <w:kern w:val="0"/>
+          <w:lang w:eastAsia="en-GB"/>
+          <w14:ligatures w14:val="none"/>
+        </w:rPr>
+        <w:br w:type="page"/>
+      </w:r>
+    </w:p>
+    <w:p>
+      <w:pPr>
+        <w:spacing w:before="100" w:beforeAutospacing="1" w:after="100" w:afterAutospacing="1" w:line="240" w:lineRule="auto"/>
+        <w:rPr>
+          <w:rFonts w:ascii="Times New Roman" w:eastAsia="Times New Roman" w:hAnsi="Times New Roman" w:cs="Times New Roman"/>
+          <w:kern w:val="0"/>
+          <w:lang w:eastAsia="en-GB"/>
+          <w14:ligatures w14:val="none"/>
+        </w:rPr>
+      </w:pPr>
+      <w:r>
+        <w:lastRenderedPageBreak/>
+        <w:t>--------------------------------------------------------</w:t>
+      </w:r>
+      <w:r>
+        <w:br/>
+      </w:r>
+      <w:r>
+        <w:br/>
+      </w:r>
+      <w:r>
+        <w:rPr>
+          <w:rFonts w:ascii="Apple Color Emoji" w:hAnsi="Apple Color Emoji" w:cs="Apple Color Emoji"/>
+        </w:rPr>
+        <w:t>🌿</w:t>
+      </w:r>
+      <w:r>
+        <w:t xml:space="preserve"> </w:t>
+      </w:r>
+      <w:proofErr w:type="spellStart"/>
+      <w:r>
+        <w:t>WildHeart</w:t>
+      </w:r>
+      <w:proofErr w:type="spellEnd"/>
+      <w:r>
+        <w:t xml:space="preserve"> Eco Park Explore Visit Us Follow Us</w:t>
+      </w:r>
+      <w:r>
+        <w:br/>
+      </w:r>
+      <w:r>
+        <w:br/>
+        <w:t xml:space="preserve">Discover amazing... About </w:t>
+      </w:r>
+      <w:r>
+        <w:rPr>
+          <w:rFonts w:ascii="Apple Color Emoji" w:hAnsi="Apple Color Emoji" w:cs="Apple Color Emoji"/>
+        </w:rPr>
+        <w:t>📍</w:t>
+      </w:r>
+      <w:r>
+        <w:t xml:space="preserve"> Hampshire </w:t>
+      </w:r>
+      <w:r>
+        <w:rPr>
+          <w:rFonts w:ascii="Apple Color Emoji" w:hAnsi="Apple Color Emoji" w:cs="Apple Color Emoji"/>
+        </w:rPr>
+        <w:t>📘</w:t>
+      </w:r>
+      <w:r>
+        <w:t xml:space="preserve"> Facebook</w:t>
+      </w:r>
+      <w:r>
+        <w:br/>
+        <w:t xml:space="preserve">Habitats </w:t>
+      </w:r>
+      <w:r>
+        <w:rPr>
+          <w:rFonts w:ascii="Apple Color Emoji" w:hAnsi="Apple Color Emoji" w:cs="Apple Color Emoji"/>
+        </w:rPr>
+        <w:t>☎</w:t>
+      </w:r>
+      <w:r>
+        <w:t xml:space="preserve"> Phone </w:t>
+      </w:r>
+      <w:r>
+        <w:rPr>
+          <w:rFonts w:ascii="Apple Color Emoji" w:hAnsi="Apple Color Emoji" w:cs="Apple Color Emoji"/>
+        </w:rPr>
+        <w:t>📸</w:t>
+      </w:r>
+      <w:r>
+        <w:t xml:space="preserve"> Instagram</w:t>
+      </w:r>
+      <w:r>
+        <w:br/>
+        <w:t xml:space="preserve">FAQ </w:t>
+      </w:r>
+      <w:r>
+        <w:rPr>
+          <w:rFonts w:ascii="Apple Color Emoji" w:hAnsi="Apple Color Emoji" w:cs="Apple Color Emoji"/>
+        </w:rPr>
+        <w:t>✉</w:t>
+      </w:r>
+      <w:r>
+        <w:t xml:space="preserve"> Email </w:t>
+      </w:r>
+      <w:r>
+        <w:rPr>
+          <w:rFonts w:ascii="Apple Color Emoji" w:hAnsi="Apple Color Emoji" w:cs="Apple Color Emoji"/>
+        </w:rPr>
+        <w:t>▶</w:t>
+      </w:r>
+      <w:r>
+        <w:t xml:space="preserve"> YouTube</w:t>
+      </w:r>
+      <w:r>
+        <w:br/>
+        <w:t xml:space="preserve">Contact </w:t>
+      </w:r>
+      <w:r>
+        <w:rPr>
+          <w:rFonts w:ascii="Apple Color Emoji" w:hAnsi="Apple Color Emoji" w:cs="Apple Color Emoji"/>
+        </w:rPr>
+        <w:t>🎵</w:t>
+      </w:r>
+      <w:r>
+        <w:t xml:space="preserve"> TikTok</w:t>
+      </w:r>
+      <w:r>
+        <w:br/>
+      </w:r>
+      <w:r>
+        <w:br/>
+        <w:t>--------------------------------------------------------</w:t>
+      </w:r>
+      <w:r>
+        <w:br/>
+      </w:r>
+      <w:r>
+        <w:br/>
+        <w:t xml:space="preserve">© 2026 </w:t>
+      </w:r>
+      <w:proofErr w:type="spellStart"/>
+      <w:r>
+        <w:t>WildHeart</w:t>
+      </w:r>
+      <w:proofErr w:type="spellEnd"/>
+      <w:r>
+        <w:t xml:space="preserve"> Eco Park</w:t>
+      </w:r>
+      <w:r>
+        <w:br/>
+      </w:r>
+      <w:r>
+        <w:br/>
+        <w:t>--------------------------------------------------------</w:t>
       </w:r>
     </w:p>
     <w:p/>
+    <w:p/>
+    <w:p/>
+    <w:p>
+      <w:pPr>
+        <w:rPr>
+          <w:rFonts w:ascii="Times New Roman" w:eastAsia="Times New Roman" w:hAnsi="Times New Roman" w:cs="Times New Roman"/>
+          <w:kern w:val="0"/>
+          <w:lang w:eastAsia="en-GB"/>
+          <w14:ligatures w14:val="none"/>
+        </w:rPr>
+      </w:pPr>
+      <w:r>
+        <w:br w:type="page"/>
+      </w:r>
+    </w:p>
+    <w:p>
+      <w:pPr>
+        <w:pStyle w:val="pdq2pgselectionanchorcontainer"/>
+      </w:pPr>
+      <w:r>
+        <w:lastRenderedPageBreak/>
+        <w:t>Make it look like this:</w:t>
+      </w:r>
+    </w:p>
+    <w:p>
+      <w:pPr>
+        <w:pStyle w:val="pdq2pgselectionanchorcontainer"/>
+      </w:pPr>
+      <w:proofErr w:type="gramStart"/>
+      <w:r>
+        <w:t>So</w:t>
+      </w:r>
+      <w:proofErr w:type="gramEnd"/>
+      <w:r>
+        <w:t xml:space="preserve"> the order will be:</w:t>
+      </w:r>
+    </w:p>
+    <w:p>
+      <w:pPr>
+        <w:pStyle w:val="HTMLPreformatted"/>
+      </w:pPr>
+      <w:r>
+        <w:rPr>
+          <w:rStyle w:val="HTMLCode"/>
+        </w:rPr>
+        <w:t>┌────────────────────────────────────┐</w:t>
+      </w:r>
+      <w:r>
+        <w:br/>
+      </w:r>
+      <w:r>
+        <w:rPr>
+          <w:rStyle w:val="HTMLCode"/>
+        </w:rPr>
+        <w:t>│ Today is Monday                    │</w:t>
+      </w:r>
+      <w:r>
+        <w:br/>
+      </w:r>
+      <w:r>
+        <w:rPr>
+          <w:rStyle w:val="HTMLCode"/>
+        </w:rPr>
+        <w:t>│                                    │</w:t>
+      </w:r>
+      <w:r>
+        <w:br/>
+      </w:r>
+      <w:r>
+        <w:rPr>
+          <w:rStyle w:val="HTMLCode"/>
+        </w:rPr>
+        <w:t xml:space="preserve">│ </w:t>
+      </w:r>
+      <w:r>
+        <w:rPr>
+          <w:rStyle w:val="HTMLCode"/>
+          <w:rFonts w:ascii="Apple Color Emoji" w:hAnsi="Apple Color Emoji" w:cs="Apple Color Emoji"/>
+        </w:rPr>
+        <w:t>🟢</w:t>
+      </w:r>
+      <w:r>
+        <w:rPr>
+          <w:rStyle w:val="HTMLCode"/>
+        </w:rPr>
+        <w:t xml:space="preserve"> We are OPEN now                 │</w:t>
+      </w:r>
+      <w:r>
+        <w:br/>
+      </w:r>
+      <w:r>
+        <w:rPr>
+          <w:rStyle w:val="HTMLCode"/>
+        </w:rPr>
+        <w:t>│                                    │</w:t>
+      </w:r>
+      <w:r>
+        <w:br/>
+      </w:r>
+      <w:r>
+        <w:rPr>
+          <w:rStyle w:val="HTMLCode"/>
+        </w:rPr>
+        <w:t>│ Next Event                         │</w:t>
+      </w:r>
+      <w:r>
+        <w:br/>
+      </w:r>
+      <w:r>
+        <w:rPr>
+          <w:rStyle w:val="HTMLCode"/>
+        </w:rPr>
+        <w:t>│ 11:30 Elephant Feeding             │</w:t>
+      </w:r>
+      <w:r>
+        <w:br/>
+      </w:r>
+      <w:r>
+        <w:rPr>
+          <w:rStyle w:val="HTMLCode"/>
+        </w:rPr>
+        <w:t>│ Guardians of the Savannah          │</w:t>
+      </w:r>
+      <w:r>
+        <w:br/>
+      </w:r>
+      <w:r>
+        <w:rPr>
+          <w:rStyle w:val="HTMLCode"/>
+        </w:rPr>
+        <w:t>└────────────────────────────────────┘</w:t>
+      </w:r>
+      <w:r>
+        <w:br/>
+      </w:r>
+      <w:r>
+        <w:br/>
+      </w:r>
+      <w:r>
+        <w:rPr>
+          <w:rStyle w:val="HTMLCode"/>
+        </w:rPr>
+        <w:t xml:space="preserve">                 Opening Times</w:t>
+      </w:r>
+      <w:r>
+        <w:br/>
+      </w:r>
+      <w:r>
+        <w:br/>
+      </w:r>
+      <w:r>
+        <w:rPr>
+          <w:rStyle w:val="HTMLCode"/>
+        </w:rPr>
+        <w:t xml:space="preserve">        </w:t>
+      </w:r>
+      <w:r>
+        <w:rPr>
+          <w:rStyle w:val="HTMLCode"/>
+          <w:rFonts w:ascii="Apple Color Emoji" w:hAnsi="Apple Color Emoji" w:cs="Apple Color Emoji"/>
+        </w:rPr>
+        <w:t>🕒</w:t>
+      </w:r>
+      <w:r>
+        <w:rPr>
+          <w:rStyle w:val="HTMLCode"/>
+        </w:rPr>
+        <w:t xml:space="preserve"> We're Open Every Day</w:t>
+      </w:r>
+      <w:r>
+        <w:br/>
+      </w:r>
+      <w:r>
+        <w:br/>
+      </w:r>
+      <w:r>
+        <w:rPr>
+          <w:rStyle w:val="HTMLCode"/>
+          <w:rFonts w:ascii="Segoe UI Symbol" w:hAnsi="Segoe UI Symbol" w:cs="Segoe UI Symbol"/>
+        </w:rPr>
+        <w:t>╭</w:t>
+      </w:r>
+      <w:r>
+        <w:rPr>
+          <w:rStyle w:val="HTMLCode"/>
+        </w:rPr>
+        <w:t>──────────────────────────────────────────────</w:t>
+      </w:r>
+      <w:r>
+        <w:rPr>
+          <w:rStyle w:val="HTMLCode"/>
+          <w:rFonts w:ascii="Segoe UI Symbol" w:hAnsi="Segoe UI Symbol" w:cs="Segoe UI Symbol"/>
+        </w:rPr>
+        <w:t>╮</w:t>
+      </w:r>
+      <w:r>
+        <w:br/>
+      </w:r>
+      <w:r>
+        <w:rPr>
+          <w:rStyle w:val="HTMLCode"/>
+        </w:rPr>
+        <w:t>│ Monday         09:00 AM      06:00 PM        │</w:t>
+      </w:r>
+      <w:r>
+        <w:br/>
+      </w:r>
+      <w:r>
+        <w:rPr>
+          <w:rStyle w:val="HTMLCode"/>
+        </w:rPr>
+        <w:t>├──────────────────────────────────────────────┤</w:t>
+      </w:r>
+      <w:r>
+        <w:br/>
+      </w:r>
+      <w:r>
+        <w:rPr>
+          <w:rStyle w:val="HTMLCode"/>
+        </w:rPr>
+        <w:t>│ Tuesday        09:00 AM      06:00 PM        │</w:t>
+      </w:r>
+      <w:r>
+        <w:br/>
+      </w:r>
+      <w:r>
+        <w:rPr>
+          <w:rStyle w:val="HTMLCode"/>
+        </w:rPr>
+        <w:t>├──────────────────────────────────────────────┤</w:t>
+      </w:r>
+      <w:r>
+        <w:br/>
+      </w:r>
+      <w:r>
+        <w:rPr>
+          <w:rStyle w:val="HTMLCode"/>
+        </w:rPr>
+        <w:t>│ Wednesday      09:00 AM      06:00 PM        │</w:t>
+      </w:r>
+      <w:r>
+        <w:br/>
+      </w:r>
+      <w:r>
+        <w:rPr>
+          <w:rStyle w:val="HTMLCode"/>
+        </w:rPr>
+        <w:t>├──────────────────────────────────────────────┤</w:t>
+      </w:r>
+      <w:r>
+        <w:br/>
+      </w:r>
+      <w:r>
+        <w:rPr>
+          <w:rStyle w:val="HTMLCode"/>
+        </w:rPr>
+        <w:t>│ Thursday       09:00 AM      06:00 PM        │</w:t>
+      </w:r>
+      <w:r>
+        <w:br/>
+      </w:r>
+      <w:r>
+        <w:rPr>
+          <w:rStyle w:val="HTMLCode"/>
+        </w:rPr>
+        <w:t>├──────────────────────────────────────────────┤</w:t>
+      </w:r>
+      <w:r>
+        <w:br/>
+      </w:r>
+      <w:r>
+        <w:rPr>
+          <w:rStyle w:val="HTMLCode"/>
+        </w:rPr>
+        <w:t>│ Friday         09:00 AM      06:00 PM        │</w:t>
+      </w:r>
+      <w:r>
+        <w:br/>
+      </w:r>
+      <w:r>
+        <w:rPr>
+          <w:rStyle w:val="HTMLCode"/>
+        </w:rPr>
+        <w:t>├──────────────────────────────────────────────┤</w:t>
+      </w:r>
+      <w:r>
+        <w:br/>
+      </w:r>
+      <w:r>
+        <w:rPr>
+          <w:rStyle w:val="HTMLCode"/>
+        </w:rPr>
+        <w:t>│ Saturday       09:00 AM      06:00 PM        │</w:t>
+      </w:r>
+      <w:r>
+        <w:br/>
+      </w:r>
+      <w:r>
+        <w:rPr>
+          <w:rStyle w:val="HTMLCode"/>
+        </w:rPr>
+        <w:t>├──────────────────────────────────────────────┤</w:t>
+      </w:r>
+      <w:r>
+        <w:br/>
+      </w:r>
+      <w:r>
+        <w:rPr>
+          <w:rStyle w:val="HTMLCode"/>
+        </w:rPr>
+        <w:t>│ Sunday         09:00 AM      06:00 PM        │</w:t>
+      </w:r>
+      <w:r>
+        <w:br/>
+      </w:r>
+      <w:r>
+        <w:rPr>
+          <w:rStyle w:val="HTMLCode"/>
+          <w:rFonts w:ascii="Segoe UI Symbol" w:hAnsi="Segoe UI Symbol" w:cs="Segoe UI Symbol"/>
+        </w:rPr>
+        <w:t>╰</w:t>
+      </w:r>
+      <w:r>
+        <w:rPr>
+          <w:rStyle w:val="HTMLCode"/>
+        </w:rPr>
+        <w:t>──────────────────────────────────────────────</w:t>
+      </w:r>
+      <w:r>
+        <w:rPr>
+          <w:rStyle w:val="HTMLCode"/>
+          <w:rFonts w:ascii="Segoe UI Symbol" w:hAnsi="Segoe UI Symbol" w:cs="Segoe UI Symbol"/>
+        </w:rPr>
+        <w:t>╯</w:t>
+      </w:r>
+      <w:r>
+        <w:br/>
+      </w:r>
+      <w:r>
+        <w:br/>
+      </w:r>
+      <w:r>
+        <w:rPr>
+          <w:rStyle w:val="HTMLCode"/>
+        </w:rPr>
+        <w:t xml:space="preserve">        Last admission: 5:00 PM</w:t>
+      </w:r>
+    </w:p>
+    <w:p>
+      <w:pPr>
+        <w:pStyle w:val="HTMLPreformatted"/>
+      </w:pPr>
+    </w:p>
     <w:sectPr>
       <w:pgSz w:w="11906" w:h="16838"/>
       <w:pgMar w:top="1440" w:right="1440" w:bottom="1440" w:left="1440" w:header="708" w:footer="708" w:gutter="0"/>
@@ -1779,7 +2594,6 @@
     <w:basedOn w:val="Normal"/>
     <w:link w:val="HTMLPreformattedChar"/>
     <w:uiPriority w:val="99"/>
-    <w:semiHidden/>
     <w:unhideWhenUsed/>
     <w:rsid w:val="00F95BBE"/>
     <w:pPr>
@@ -1817,7 +2631,6 @@
     <w:basedOn w:val="DefaultParagraphFont"/>
     <w:link w:val="HTMLPreformatted"/>
     <w:uiPriority w:val="99"/>
-    <w:semiHidden/>
     <w:rsid w:val="00F95BBE"/>
     <w:rPr>
       <w:rFonts w:ascii="Courier New" w:eastAsia="Times New Roman" w:hAnsi="Courier New" w:cs="Courier New"/>

</xml_diff>

<commit_message>
Completed Amazon habitat page and added About Us page
</commit_message>
<xml_diff>
--- a/20061275.docx
+++ b/20061275.docx
@@ -1632,6 +1632,149 @@
           <w:rStyle w:val="HTMLCode"/>
         </w:rPr>
         <w:t xml:space="preserve">        Last admission: 5:00 PM</w:t>
+      </w:r>
+    </w:p>
+    <w:p>
+      <w:pPr>
+        <w:rPr>
+          <w:rFonts w:ascii="Courier New" w:eastAsia="Times New Roman" w:hAnsi="Courier New" w:cs="Courier New"/>
+          <w:kern w:val="0"/>
+          <w:sz w:val="20"/>
+          <w:szCs w:val="20"/>
+          <w:lang w:eastAsia="en-GB"/>
+          <w14:ligatures w14:val="none"/>
+        </w:rPr>
+      </w:pPr>
+      <w:r>
+        <w:br w:type="page"/>
+      </w:r>
+    </w:p>
+    <w:p>
+      <w:pPr>
+        <w:pStyle w:val="pdq2pgselectionanchorcontainer"/>
+      </w:pPr>
+      <w:r>
+        <w:lastRenderedPageBreak/>
+        <w:t>each habitat page:</w:t>
+      </w:r>
+    </w:p>
+    <w:p>
+      <w:pPr>
+        <w:pStyle w:val="HTMLPreformatted"/>
+      </w:pPr>
+      <w:r>
+        <w:rPr>
+          <w:rStyle w:val="HTMLCode"/>
+        </w:rPr>
+        <w:t>Hero video</w:t>
+      </w:r>
+      <w:r>
+        <w:br/>
+      </w:r>
+      <w:r>
+        <w:rPr>
+          <w:rStyle w:val="HTMLCode"/>
+        </w:rPr>
+        <w:t>↓</w:t>
+      </w:r>
+      <w:r>
+        <w:br/>
+      </w:r>
+      <w:r>
+        <w:rPr>
+          <w:rStyle w:val="HTMLCode"/>
+        </w:rPr>
+        <w:t>Habitat title + short intro</w:t>
+      </w:r>
+      <w:r>
+        <w:br/>
+      </w:r>
+      <w:r>
+        <w:rPr>
+          <w:rStyle w:val="HTMLCode"/>
+        </w:rPr>
+        <w:t>↓</w:t>
+      </w:r>
+      <w:r>
+        <w:br/>
+      </w:r>
+      <w:r>
+        <w:rPr>
+          <w:rStyle w:val="HTMLCode"/>
+        </w:rPr>
+        <w:t>About this habitat</w:t>
+      </w:r>
+      <w:r>
+        <w:br/>
+      </w:r>
+      <w:r>
+        <w:rPr>
+          <w:rStyle w:val="HTMLCode"/>
+        </w:rPr>
+        <w:t>↓</w:t>
+      </w:r>
+      <w:r>
+        <w:br/>
+      </w:r>
+      <w:r>
+        <w:rPr>
+          <w:rStyle w:val="HTMLCode"/>
+        </w:rPr>
+        <w:t>4 experience cards</w:t>
+      </w:r>
+      <w:r>
+        <w:br/>
+      </w:r>
+      <w:r>
+        <w:rPr>
+          <w:rStyle w:val="HTMLCode"/>
+        </w:rPr>
+        <w:t>↓</w:t>
+      </w:r>
+      <w:r>
+        <w:br/>
+      </w:r>
+      <w:r>
+        <w:rPr>
+          <w:rStyle w:val="HTMLCode"/>
+        </w:rPr>
+        <w:t>Conservation message</w:t>
+      </w:r>
+      <w:r>
+        <w:br/>
+      </w:r>
+      <w:r>
+        <w:rPr>
+          <w:rStyle w:val="HTMLCode"/>
+        </w:rPr>
+        <w:t>↓</w:t>
+      </w:r>
+      <w:r>
+        <w:br/>
+      </w:r>
+      <w:r>
+        <w:rPr>
+          <w:rStyle w:val="HTMLCode"/>
+        </w:rPr>
+        <w:t>Back to Home button</w:t>
+      </w:r>
+      <w:r>
+        <w:br/>
+      </w:r>
+      <w:r>
+        <w:rPr>
+          <w:rStyle w:val="HTMLCode"/>
+        </w:rPr>
+        <w:t>↓</w:t>
+      </w:r>
+      <w:r>
+        <w:br/>
+      </w:r>
+      <w:r>
+        <w:rPr>
+          <w:rStyle w:val="HTMLCode"/>
+        </w:rPr>
+        <w:t>Footer</w:t>
       </w:r>
     </w:p>
     <w:p>

</xml_diff>

<commit_message>
Implement SQLite database and Express routing
</commit_message>
<xml_diff>
--- a/20061275.docx
+++ b/20061275.docx
@@ -786,22 +786,6 @@
       <w:r>
         <w:br w:type="page"/>
       </w:r>
-    </w:p>
-    <w:p>
-      <w:pPr>
-        <w:spacing w:before="100" w:beforeAutospacing="1" w:after="100" w:afterAutospacing="1" w:line="240" w:lineRule="auto"/>
-        <w:outlineLvl w:val="1"/>
-        <w:rPr>
-          <w:rFonts w:ascii="Times New Roman" w:eastAsia="Times New Roman" w:hAnsi="Times New Roman" w:cs="Times New Roman"/>
-          <w:b/>
-          <w:bCs/>
-          <w:kern w:val="0"/>
-          <w:sz w:val="36"/>
-          <w:szCs w:val="36"/>
-          <w:lang w:eastAsia="en-GB"/>
-          <w14:ligatures w14:val="none"/>
-        </w:rPr>
-      </w:pPr>
       <w:r>
         <w:rPr>
           <w:rFonts w:ascii="Times New Roman" w:eastAsia="Times New Roman" w:hAnsi="Times New Roman" w:cs="Times New Roman"/>
@@ -1777,6 +1761,2057 @@
         <w:t>Footer</w:t>
       </w:r>
     </w:p>
+    <w:p>
+      <w:pPr>
+        <w:pStyle w:val="HTMLPreformatted"/>
+      </w:pPr>
+    </w:p>
+    <w:p>
+      <w:pPr>
+        <w:pStyle w:val="HTMLPreformatted"/>
+      </w:pPr>
+    </w:p>
+    <w:p>
+      <w:pPr>
+        <w:pStyle w:val="HTMLPreformatted"/>
+      </w:pPr>
+    </w:p>
+    <w:p>
+      <w:pPr>
+        <w:pStyle w:val="HTMLPreformatted"/>
+      </w:pPr>
+    </w:p>
+    <w:p>
+      <w:pPr>
+        <w:pStyle w:val="HTMLPreformatted"/>
+      </w:pPr>
+      <w:r>
+        <w:t xml:space="preserve">project-folder/ </w:t>
+      </w:r>
+    </w:p>
+    <w:p>
+      <w:pPr>
+        <w:pStyle w:val="HTMLPreformatted"/>
+      </w:pPr>
+      <w:r>
+        <w:t xml:space="preserve">│ </w:t>
+      </w:r>
+    </w:p>
+    <w:p>
+      <w:pPr>
+        <w:pStyle w:val="HTMLPreformatted"/>
+      </w:pPr>
+      <w:r>
+        <w:rPr>
+          <w:rFonts w:ascii="MS Gothic" w:eastAsia="MS Gothic" w:hAnsi="MS Gothic" w:cs="MS Gothic" w:hint="eastAsia"/>
+        </w:rPr>
+        <w:t>├</w:t>
+      </w:r>
+      <w:r>
+        <w:t xml:space="preserve">── </w:t>
+      </w:r>
+      <w:proofErr w:type="spellStart"/>
+      <w:r>
+        <w:t>index.mjs</w:t>
+      </w:r>
+      <w:proofErr w:type="spellEnd"/>
+      <w:r>
+        <w:t xml:space="preserve"> </w:t>
+      </w:r>
+    </w:p>
+    <w:p>
+      <w:pPr>
+        <w:pStyle w:val="HTMLPreformatted"/>
+      </w:pPr>
+      <w:r>
+        <w:rPr>
+          <w:rFonts w:ascii="MS Gothic" w:eastAsia="MS Gothic" w:hAnsi="MS Gothic" w:cs="MS Gothic" w:hint="eastAsia"/>
+        </w:rPr>
+        <w:t>├</w:t>
+      </w:r>
+      <w:r>
+        <w:t xml:space="preserve">── </w:t>
+      </w:r>
+      <w:proofErr w:type="spellStart"/>
+      <w:proofErr w:type="gramStart"/>
+      <w:r>
+        <w:t>package.json</w:t>
+      </w:r>
+      <w:proofErr w:type="spellEnd"/>
+      <w:proofErr w:type="gramEnd"/>
+      <w:r>
+        <w:t xml:space="preserve"> </w:t>
+      </w:r>
+    </w:p>
+    <w:p>
+      <w:pPr>
+        <w:pStyle w:val="HTMLPreformatted"/>
+      </w:pPr>
+      <w:r>
+        <w:rPr>
+          <w:rFonts w:ascii="MS Gothic" w:eastAsia="MS Gothic" w:hAnsi="MS Gothic" w:cs="MS Gothic" w:hint="eastAsia"/>
+        </w:rPr>
+        <w:t>├</w:t>
+      </w:r>
+      <w:r>
+        <w:t xml:space="preserve">── public/ </w:t>
+      </w:r>
+    </w:p>
+    <w:p>
+      <w:pPr>
+        <w:pStyle w:val="HTMLPreformatted"/>
+      </w:pPr>
+      <w:r>
+        <w:t xml:space="preserve">│ </w:t>
+      </w:r>
+      <w:r>
+        <w:tab/>
+      </w:r>
+      <w:r>
+        <w:rPr>
+          <w:rFonts w:ascii="MS Gothic" w:eastAsia="MS Gothic" w:hAnsi="MS Gothic" w:cs="MS Gothic" w:hint="eastAsia"/>
+        </w:rPr>
+        <w:t>├</w:t>
+      </w:r>
+      <w:r>
+        <w:t xml:space="preserve">── styles/ </w:t>
+      </w:r>
+    </w:p>
+    <w:p>
+      <w:pPr>
+        <w:pStyle w:val="HTMLPreformatted"/>
+      </w:pPr>
+      <w:r>
+        <w:t xml:space="preserve">│ </w:t>
+      </w:r>
+      <w:r>
+        <w:tab/>
+      </w:r>
+      <w:r>
+        <w:rPr>
+          <w:rFonts w:ascii="MS Gothic" w:eastAsia="MS Gothic" w:hAnsi="MS Gothic" w:cs="MS Gothic" w:hint="eastAsia"/>
+        </w:rPr>
+        <w:t>├</w:t>
+      </w:r>
+      <w:r>
+        <w:t xml:space="preserve">── scripts/ </w:t>
+      </w:r>
+    </w:p>
+    <w:p>
+      <w:pPr>
+        <w:pStyle w:val="HTMLPreformatted"/>
+      </w:pPr>
+      <w:r>
+        <w:t xml:space="preserve">│ </w:t>
+      </w:r>
+      <w:r>
+        <w:tab/>
+      </w:r>
+      <w:r>
+        <w:rPr>
+          <w:rFonts w:ascii="MS Gothic" w:eastAsia="MS Gothic" w:hAnsi="MS Gothic" w:cs="MS Gothic" w:hint="eastAsia"/>
+        </w:rPr>
+        <w:t>├</w:t>
+      </w:r>
+      <w:r>
+        <w:t xml:space="preserve">── images/ </w:t>
+      </w:r>
+    </w:p>
+    <w:p>
+      <w:pPr>
+        <w:pStyle w:val="HTMLPreformatted"/>
+      </w:pPr>
+      <w:r>
+        <w:t xml:space="preserve">│ </w:t>
+      </w:r>
+      <w:r>
+        <w:tab/>
+      </w:r>
+      <w:r>
+        <w:t xml:space="preserve">└── videos/ </w:t>
+      </w:r>
+    </w:p>
+    <w:p>
+      <w:pPr>
+        <w:pStyle w:val="HTMLPreformatted"/>
+      </w:pPr>
+      <w:r>
+        <w:t xml:space="preserve">│ </w:t>
+      </w:r>
+    </w:p>
+    <w:p>
+      <w:pPr>
+        <w:pStyle w:val="HTMLPreformatted"/>
+      </w:pPr>
+      <w:r>
+        <w:rPr>
+          <w:rFonts w:ascii="MS Gothic" w:eastAsia="MS Gothic" w:hAnsi="MS Gothic" w:cs="MS Gothic" w:hint="eastAsia"/>
+        </w:rPr>
+        <w:t>├</w:t>
+      </w:r>
+      <w:r>
+        <w:t xml:space="preserve">── views/ </w:t>
+      </w:r>
+    </w:p>
+    <w:p>
+      <w:pPr>
+        <w:pStyle w:val="HTMLPreformatted"/>
+      </w:pPr>
+      <w:r>
+        <w:t xml:space="preserve">│ </w:t>
+      </w:r>
+      <w:r>
+        <w:tab/>
+      </w:r>
+      <w:r>
+        <w:rPr>
+          <w:rFonts w:ascii="MS Gothic" w:eastAsia="MS Gothic" w:hAnsi="MS Gothic" w:cs="MS Gothic" w:hint="eastAsia"/>
+        </w:rPr>
+        <w:t>├</w:t>
+      </w:r>
+      <w:r>
+        <w:t xml:space="preserve">── </w:t>
+      </w:r>
+      <w:proofErr w:type="spellStart"/>
+      <w:r>
+        <w:t>index.ejs</w:t>
+      </w:r>
+      <w:proofErr w:type="spellEnd"/>
+      <w:r>
+        <w:t xml:space="preserve"> </w:t>
+      </w:r>
+    </w:p>
+    <w:p>
+      <w:pPr>
+        <w:pStyle w:val="HTMLPreformatted"/>
+      </w:pPr>
+      <w:r>
+        <w:t xml:space="preserve">│ </w:t>
+      </w:r>
+      <w:r>
+        <w:tab/>
+      </w:r>
+      <w:r>
+        <w:rPr>
+          <w:rFonts w:ascii="MS Gothic" w:eastAsia="MS Gothic" w:hAnsi="MS Gothic" w:cs="MS Gothic" w:hint="eastAsia"/>
+        </w:rPr>
+        <w:t>├</w:t>
+      </w:r>
+      <w:r>
+        <w:t xml:space="preserve">── </w:t>
+      </w:r>
+      <w:proofErr w:type="spellStart"/>
+      <w:r>
+        <w:t>amazon.ejs</w:t>
+      </w:r>
+      <w:proofErr w:type="spellEnd"/>
+      <w:r>
+        <w:t xml:space="preserve"> </w:t>
+      </w:r>
+    </w:p>
+    <w:p>
+      <w:pPr>
+        <w:pStyle w:val="HTMLPreformatted"/>
+      </w:pPr>
+      <w:r>
+        <w:t>│</w:t>
+      </w:r>
+      <w:r>
+        <w:tab/>
+      </w:r>
+      <w:r>
+        <w:rPr>
+          <w:rFonts w:ascii="MS Gothic" w:eastAsia="MS Gothic" w:hAnsi="MS Gothic" w:cs="MS Gothic" w:hint="eastAsia"/>
+        </w:rPr>
+        <w:t>├</w:t>
+      </w:r>
+      <w:r>
+        <w:t xml:space="preserve">── </w:t>
+      </w:r>
+      <w:proofErr w:type="spellStart"/>
+      <w:r>
+        <w:t>about.ejs</w:t>
+      </w:r>
+      <w:proofErr w:type="spellEnd"/>
+      <w:r>
+        <w:t xml:space="preserve"> </w:t>
+      </w:r>
+    </w:p>
+    <w:p>
+      <w:pPr>
+        <w:pStyle w:val="HTMLPreformatted"/>
+      </w:pPr>
+      <w:r>
+        <w:t xml:space="preserve">│ </w:t>
+      </w:r>
+      <w:r>
+        <w:tab/>
+      </w:r>
+      <w:r>
+        <w:t xml:space="preserve">└── </w:t>
+      </w:r>
+      <w:proofErr w:type="spellStart"/>
+      <w:r>
+        <w:t>contact.ejs</w:t>
+      </w:r>
+      <w:proofErr w:type="spellEnd"/>
+      <w:r>
+        <w:t xml:space="preserve"> </w:t>
+      </w:r>
+    </w:p>
+    <w:p>
+      <w:pPr>
+        <w:pStyle w:val="HTMLPreformatted"/>
+      </w:pPr>
+      <w:r>
+        <w:t xml:space="preserve">│ </w:t>
+      </w:r>
+    </w:p>
+    <w:p>
+      <w:pPr>
+        <w:pStyle w:val="HTMLPreformatted"/>
+      </w:pPr>
+      <w:r>
+        <w:t xml:space="preserve">└── database/ </w:t>
+      </w:r>
+    </w:p>
+    <w:p>
+      <w:pPr>
+        <w:pStyle w:val="HTMLPreformatted"/>
+      </w:pPr>
+      <w:r>
+        <w:tab/>
+      </w:r>
+      <w:r>
+        <w:t xml:space="preserve">└── </w:t>
+      </w:r>
+      <w:proofErr w:type="spellStart"/>
+      <w:r>
+        <w:t>wildheart.db</w:t>
+      </w:r>
+      <w:proofErr w:type="spellEnd"/>
+    </w:p>
+    <w:p>
+      <w:pPr>
+        <w:pStyle w:val="HTMLPreformatted"/>
+      </w:pPr>
+    </w:p>
+    <w:p>
+      <w:pPr>
+        <w:pStyle w:val="HTMLPreformatted"/>
+      </w:pPr>
+    </w:p>
+    <w:p>
+      <w:pPr>
+        <w:rPr>
+          <w:rFonts w:ascii="Courier New" w:eastAsia="Times New Roman" w:hAnsi="Courier New" w:cs="Courier New"/>
+          <w:kern w:val="0"/>
+          <w:sz w:val="20"/>
+          <w:szCs w:val="20"/>
+          <w:lang w:eastAsia="en-GB"/>
+          <w14:ligatures w14:val="none"/>
+        </w:rPr>
+      </w:pPr>
+      <w:r>
+        <w:br w:type="page"/>
+      </w:r>
+    </w:p>
+    <w:p>
+      <w:pPr>
+        <w:spacing w:before="100" w:beforeAutospacing="1" w:after="100" w:afterAutospacing="1" w:line="240" w:lineRule="auto"/>
+        <w:outlineLvl w:val="1"/>
+        <w:rPr>
+          <w:rFonts w:ascii="Times New Roman" w:eastAsia="Times New Roman" w:hAnsi="Times New Roman" w:cs="Times New Roman"/>
+          <w:b/>
+          <w:bCs/>
+          <w:kern w:val="0"/>
+          <w:sz w:val="36"/>
+          <w:szCs w:val="36"/>
+          <w:lang w:eastAsia="en-GB"/>
+          <w14:ligatures w14:val="none"/>
+        </w:rPr>
+      </w:pPr>
+      <w:r>
+        <w:rPr>
+          <w:rFonts w:ascii="Times New Roman" w:eastAsia="Times New Roman" w:hAnsi="Times New Roman" w:cs="Times New Roman"/>
+          <w:b/>
+          <w:bCs/>
+          <w:kern w:val="0"/>
+          <w:sz w:val="36"/>
+          <w:szCs w:val="36"/>
+          <w:lang w:eastAsia="en-GB"/>
+          <w14:ligatures w14:val="none"/>
+        </w:rPr>
+        <w:lastRenderedPageBreak/>
+        <w:t>Recommended database feature</w:t>
+      </w:r>
+    </w:p>
+    <w:p>
+      <w:pPr>
+        <w:spacing w:before="100" w:beforeAutospacing="1" w:after="100" w:afterAutospacing="1" w:line="240" w:lineRule="auto"/>
+        <w:rPr>
+          <w:rFonts w:ascii="Times New Roman" w:eastAsia="Times New Roman" w:hAnsi="Times New Roman" w:cs="Times New Roman"/>
+          <w:kern w:val="0"/>
+          <w:lang w:eastAsia="en-GB"/>
+          <w14:ligatures w14:val="none"/>
+        </w:rPr>
+      </w:pPr>
+      <w:r>
+        <w:rPr>
+          <w:rFonts w:ascii="Times New Roman" w:eastAsia="Times New Roman" w:hAnsi="Times New Roman" w:cs="Times New Roman"/>
+          <w:kern w:val="0"/>
+          <w:lang w:eastAsia="en-GB"/>
+          <w14:ligatures w14:val="none"/>
+        </w:rPr>
+        <w:t>Use the database to retrieve the experiences for each habitat.</w:t>
+      </w:r>
+    </w:p>
+    <w:p>
+      <w:pPr>
+        <w:spacing w:before="100" w:beforeAutospacing="1" w:after="100" w:afterAutospacing="1" w:line="240" w:lineRule="auto"/>
+        <w:rPr>
+          <w:rFonts w:ascii="Times New Roman" w:eastAsia="Times New Roman" w:hAnsi="Times New Roman" w:cs="Times New Roman"/>
+          <w:kern w:val="0"/>
+          <w:lang w:eastAsia="en-GB"/>
+          <w14:ligatures w14:val="none"/>
+        </w:rPr>
+      </w:pPr>
+      <w:r>
+        <w:rPr>
+          <w:rFonts w:ascii="Times New Roman" w:eastAsia="Times New Roman" w:hAnsi="Times New Roman" w:cs="Times New Roman"/>
+          <w:kern w:val="0"/>
+          <w:lang w:eastAsia="en-GB"/>
+          <w14:ligatures w14:val="none"/>
+        </w:rPr>
+        <w:t>For example, one habitat can have several experiences:</w:t>
+      </w:r>
+    </w:p>
+    <w:p>
+      <w:pPr>
+        <w:tabs>
+          <w:tab w:val="left" w:pos="916"/>
+          <w:tab w:val="left" w:pos="1832"/>
+          <w:tab w:val="left" w:pos="2748"/>
+          <w:tab w:val="left" w:pos="3664"/>
+          <w:tab w:val="left" w:pos="4580"/>
+          <w:tab w:val="left" w:pos="5496"/>
+          <w:tab w:val="left" w:pos="6412"/>
+          <w:tab w:val="left" w:pos="7328"/>
+          <w:tab w:val="left" w:pos="8244"/>
+          <w:tab w:val="left" w:pos="9160"/>
+          <w:tab w:val="left" w:pos="10076"/>
+          <w:tab w:val="left" w:pos="10992"/>
+          <w:tab w:val="left" w:pos="11908"/>
+          <w:tab w:val="left" w:pos="12824"/>
+          <w:tab w:val="left" w:pos="13740"/>
+          <w:tab w:val="left" w:pos="14656"/>
+        </w:tabs>
+        <w:spacing w:after="0" w:line="240" w:lineRule="auto"/>
+        <w:rPr>
+          <w:rFonts w:ascii="Courier New" w:eastAsia="Times New Roman" w:hAnsi="Courier New" w:cs="Courier New"/>
+          <w:kern w:val="0"/>
+          <w:sz w:val="20"/>
+          <w:szCs w:val="20"/>
+          <w:lang w:eastAsia="en-GB"/>
+          <w14:ligatures w14:val="none"/>
+        </w:rPr>
+      </w:pPr>
+      <w:r>
+        <w:rPr>
+          <w:rFonts w:ascii="Courier New" w:eastAsia="Times New Roman" w:hAnsi="Courier New" w:cs="Courier New"/>
+          <w:kern w:val="0"/>
+          <w:sz w:val="20"/>
+          <w:szCs w:val="20"/>
+          <w:lang w:eastAsia="en-GB"/>
+          <w14:ligatures w14:val="none"/>
+        </w:rPr>
+        <w:t>Habitats</w:t>
+      </w:r>
+    </w:p>
+    <w:p>
+      <w:pPr>
+        <w:tabs>
+          <w:tab w:val="left" w:pos="916"/>
+          <w:tab w:val="left" w:pos="1832"/>
+          <w:tab w:val="left" w:pos="2748"/>
+          <w:tab w:val="left" w:pos="3664"/>
+          <w:tab w:val="left" w:pos="4580"/>
+          <w:tab w:val="left" w:pos="5496"/>
+          <w:tab w:val="left" w:pos="6412"/>
+          <w:tab w:val="left" w:pos="7328"/>
+          <w:tab w:val="left" w:pos="8244"/>
+          <w:tab w:val="left" w:pos="9160"/>
+          <w:tab w:val="left" w:pos="10076"/>
+          <w:tab w:val="left" w:pos="10992"/>
+          <w:tab w:val="left" w:pos="11908"/>
+          <w:tab w:val="left" w:pos="12824"/>
+          <w:tab w:val="left" w:pos="13740"/>
+          <w:tab w:val="left" w:pos="14656"/>
+        </w:tabs>
+        <w:spacing w:after="0" w:line="240" w:lineRule="auto"/>
+        <w:rPr>
+          <w:rFonts w:ascii="Courier New" w:eastAsia="Times New Roman" w:hAnsi="Courier New" w:cs="Courier New"/>
+          <w:kern w:val="0"/>
+          <w:sz w:val="20"/>
+          <w:szCs w:val="20"/>
+          <w:lang w:eastAsia="en-GB"/>
+          <w14:ligatures w14:val="none"/>
+        </w:rPr>
+      </w:pPr>
+      <w:r>
+        <w:rPr>
+          <w:rFonts w:ascii="Courier New" w:eastAsia="Times New Roman" w:hAnsi="Courier New" w:cs="Courier New"/>
+          <w:kern w:val="0"/>
+          <w:sz w:val="20"/>
+          <w:szCs w:val="20"/>
+          <w:lang w:eastAsia="en-GB"/>
+          <w14:ligatures w14:val="none"/>
+        </w:rPr>
+        <w:t>──────────────</w:t>
+      </w:r>
+    </w:p>
+    <w:p>
+      <w:pPr>
+        <w:tabs>
+          <w:tab w:val="left" w:pos="916"/>
+          <w:tab w:val="left" w:pos="1832"/>
+          <w:tab w:val="left" w:pos="2748"/>
+          <w:tab w:val="left" w:pos="3664"/>
+          <w:tab w:val="left" w:pos="4580"/>
+          <w:tab w:val="left" w:pos="5496"/>
+          <w:tab w:val="left" w:pos="6412"/>
+          <w:tab w:val="left" w:pos="7328"/>
+          <w:tab w:val="left" w:pos="8244"/>
+          <w:tab w:val="left" w:pos="9160"/>
+          <w:tab w:val="left" w:pos="10076"/>
+          <w:tab w:val="left" w:pos="10992"/>
+          <w:tab w:val="left" w:pos="11908"/>
+          <w:tab w:val="left" w:pos="12824"/>
+          <w:tab w:val="left" w:pos="13740"/>
+          <w:tab w:val="left" w:pos="14656"/>
+        </w:tabs>
+        <w:spacing w:after="0" w:line="240" w:lineRule="auto"/>
+        <w:rPr>
+          <w:rFonts w:ascii="Courier New" w:eastAsia="Times New Roman" w:hAnsi="Courier New" w:cs="Courier New"/>
+          <w:kern w:val="0"/>
+          <w:sz w:val="20"/>
+          <w:szCs w:val="20"/>
+          <w:lang w:eastAsia="en-GB"/>
+          <w14:ligatures w14:val="none"/>
+        </w:rPr>
+      </w:pPr>
+      <w:proofErr w:type="gramStart"/>
+      <w:r>
+        <w:rPr>
+          <w:rFonts w:ascii="Courier New" w:eastAsia="Times New Roman" w:hAnsi="Courier New" w:cs="Courier New"/>
+          <w:kern w:val="0"/>
+          <w:sz w:val="20"/>
+          <w:szCs w:val="20"/>
+          <w:lang w:eastAsia="en-GB"/>
+          <w14:ligatures w14:val="none"/>
+        </w:rPr>
+        <w:t>1  Amazon</w:t>
+      </w:r>
+      <w:proofErr w:type="gramEnd"/>
+    </w:p>
+    <w:p>
+      <w:pPr>
+        <w:tabs>
+          <w:tab w:val="left" w:pos="916"/>
+          <w:tab w:val="left" w:pos="1832"/>
+          <w:tab w:val="left" w:pos="2748"/>
+          <w:tab w:val="left" w:pos="3664"/>
+          <w:tab w:val="left" w:pos="4580"/>
+          <w:tab w:val="left" w:pos="5496"/>
+          <w:tab w:val="left" w:pos="6412"/>
+          <w:tab w:val="left" w:pos="7328"/>
+          <w:tab w:val="left" w:pos="8244"/>
+          <w:tab w:val="left" w:pos="9160"/>
+          <w:tab w:val="left" w:pos="10076"/>
+          <w:tab w:val="left" w:pos="10992"/>
+          <w:tab w:val="left" w:pos="11908"/>
+          <w:tab w:val="left" w:pos="12824"/>
+          <w:tab w:val="left" w:pos="13740"/>
+          <w:tab w:val="left" w:pos="14656"/>
+        </w:tabs>
+        <w:spacing w:after="0" w:line="240" w:lineRule="auto"/>
+        <w:rPr>
+          <w:rFonts w:ascii="Courier New" w:eastAsia="Times New Roman" w:hAnsi="Courier New" w:cs="Courier New"/>
+          <w:kern w:val="0"/>
+          <w:sz w:val="20"/>
+          <w:szCs w:val="20"/>
+          <w:lang w:eastAsia="en-GB"/>
+          <w14:ligatures w14:val="none"/>
+        </w:rPr>
+      </w:pPr>
+      <w:proofErr w:type="gramStart"/>
+      <w:r>
+        <w:rPr>
+          <w:rFonts w:ascii="Courier New" w:eastAsia="Times New Roman" w:hAnsi="Courier New" w:cs="Courier New"/>
+          <w:kern w:val="0"/>
+          <w:sz w:val="20"/>
+          <w:szCs w:val="20"/>
+          <w:lang w:eastAsia="en-GB"/>
+          <w14:ligatures w14:val="none"/>
+        </w:rPr>
+        <w:t>2  Savannah</w:t>
+      </w:r>
+      <w:proofErr w:type="gramEnd"/>
+    </w:p>
+    <w:p>
+      <w:pPr>
+        <w:tabs>
+          <w:tab w:val="left" w:pos="916"/>
+          <w:tab w:val="left" w:pos="1832"/>
+          <w:tab w:val="left" w:pos="2748"/>
+          <w:tab w:val="left" w:pos="3664"/>
+          <w:tab w:val="left" w:pos="4580"/>
+          <w:tab w:val="left" w:pos="5496"/>
+          <w:tab w:val="left" w:pos="6412"/>
+          <w:tab w:val="left" w:pos="7328"/>
+          <w:tab w:val="left" w:pos="8244"/>
+          <w:tab w:val="left" w:pos="9160"/>
+          <w:tab w:val="left" w:pos="10076"/>
+          <w:tab w:val="left" w:pos="10992"/>
+          <w:tab w:val="left" w:pos="11908"/>
+          <w:tab w:val="left" w:pos="12824"/>
+          <w:tab w:val="left" w:pos="13740"/>
+          <w:tab w:val="left" w:pos="14656"/>
+        </w:tabs>
+        <w:spacing w:after="0" w:line="240" w:lineRule="auto"/>
+        <w:rPr>
+          <w:rFonts w:ascii="Courier New" w:eastAsia="Times New Roman" w:hAnsi="Courier New" w:cs="Courier New"/>
+          <w:kern w:val="0"/>
+          <w:sz w:val="20"/>
+          <w:szCs w:val="20"/>
+          <w:lang w:eastAsia="en-GB"/>
+          <w14:ligatures w14:val="none"/>
+        </w:rPr>
+      </w:pPr>
+      <w:proofErr w:type="gramStart"/>
+      <w:r>
+        <w:rPr>
+          <w:rFonts w:ascii="Courier New" w:eastAsia="Times New Roman" w:hAnsi="Courier New" w:cs="Courier New"/>
+          <w:kern w:val="0"/>
+          <w:sz w:val="20"/>
+          <w:szCs w:val="20"/>
+          <w:lang w:eastAsia="en-GB"/>
+          <w14:ligatures w14:val="none"/>
+        </w:rPr>
+        <w:t>3  Coral</w:t>
+      </w:r>
+      <w:proofErr w:type="gramEnd"/>
+      <w:r>
+        <w:rPr>
+          <w:rFonts w:ascii="Courier New" w:eastAsia="Times New Roman" w:hAnsi="Courier New" w:cs="Courier New"/>
+          <w:kern w:val="0"/>
+          <w:sz w:val="20"/>
+          <w:szCs w:val="20"/>
+          <w:lang w:eastAsia="en-GB"/>
+          <w14:ligatures w14:val="none"/>
+        </w:rPr>
+        <w:t xml:space="preserve"> Cove</w:t>
+      </w:r>
+    </w:p>
+    <w:p>
+      <w:pPr>
+        <w:tabs>
+          <w:tab w:val="left" w:pos="916"/>
+          <w:tab w:val="left" w:pos="1832"/>
+          <w:tab w:val="left" w:pos="2748"/>
+          <w:tab w:val="left" w:pos="3664"/>
+          <w:tab w:val="left" w:pos="4580"/>
+          <w:tab w:val="left" w:pos="5496"/>
+          <w:tab w:val="left" w:pos="6412"/>
+          <w:tab w:val="left" w:pos="7328"/>
+          <w:tab w:val="left" w:pos="8244"/>
+          <w:tab w:val="left" w:pos="9160"/>
+          <w:tab w:val="left" w:pos="10076"/>
+          <w:tab w:val="left" w:pos="10992"/>
+          <w:tab w:val="left" w:pos="11908"/>
+          <w:tab w:val="left" w:pos="12824"/>
+          <w:tab w:val="left" w:pos="13740"/>
+          <w:tab w:val="left" w:pos="14656"/>
+        </w:tabs>
+        <w:spacing w:after="0" w:line="240" w:lineRule="auto"/>
+        <w:rPr>
+          <w:rFonts w:ascii="Courier New" w:eastAsia="Times New Roman" w:hAnsi="Courier New" w:cs="Courier New"/>
+          <w:kern w:val="0"/>
+          <w:sz w:val="20"/>
+          <w:szCs w:val="20"/>
+          <w:lang w:eastAsia="en-GB"/>
+          <w14:ligatures w14:val="none"/>
+        </w:rPr>
+      </w:pPr>
+      <w:proofErr w:type="gramStart"/>
+      <w:r>
+        <w:rPr>
+          <w:rFonts w:ascii="Courier New" w:eastAsia="Times New Roman" w:hAnsi="Courier New" w:cs="Courier New"/>
+          <w:kern w:val="0"/>
+          <w:sz w:val="20"/>
+          <w:szCs w:val="20"/>
+          <w:lang w:eastAsia="en-GB"/>
+          <w14:ligatures w14:val="none"/>
+        </w:rPr>
+        <w:t>4  Reptile</w:t>
+      </w:r>
+      <w:proofErr w:type="gramEnd"/>
+      <w:r>
+        <w:rPr>
+          <w:rFonts w:ascii="Courier New" w:eastAsia="Times New Roman" w:hAnsi="Courier New" w:cs="Courier New"/>
+          <w:kern w:val="0"/>
+          <w:sz w:val="20"/>
+          <w:szCs w:val="20"/>
+          <w:lang w:eastAsia="en-GB"/>
+          <w14:ligatures w14:val="none"/>
+        </w:rPr>
+        <w:t xml:space="preserve"> Realm</w:t>
+      </w:r>
+    </w:p>
+    <w:p>
+      <w:pPr>
+        <w:tabs>
+          <w:tab w:val="left" w:pos="916"/>
+          <w:tab w:val="left" w:pos="1832"/>
+          <w:tab w:val="left" w:pos="2748"/>
+          <w:tab w:val="left" w:pos="3664"/>
+          <w:tab w:val="left" w:pos="4580"/>
+          <w:tab w:val="left" w:pos="5496"/>
+          <w:tab w:val="left" w:pos="6412"/>
+          <w:tab w:val="left" w:pos="7328"/>
+          <w:tab w:val="left" w:pos="8244"/>
+          <w:tab w:val="left" w:pos="9160"/>
+          <w:tab w:val="left" w:pos="10076"/>
+          <w:tab w:val="left" w:pos="10992"/>
+          <w:tab w:val="left" w:pos="11908"/>
+          <w:tab w:val="left" w:pos="12824"/>
+          <w:tab w:val="left" w:pos="13740"/>
+          <w:tab w:val="left" w:pos="14656"/>
+        </w:tabs>
+        <w:spacing w:after="0" w:line="240" w:lineRule="auto"/>
+        <w:rPr>
+          <w:rFonts w:ascii="Courier New" w:eastAsia="Times New Roman" w:hAnsi="Courier New" w:cs="Courier New"/>
+          <w:kern w:val="0"/>
+          <w:sz w:val="20"/>
+          <w:szCs w:val="20"/>
+          <w:lang w:eastAsia="en-GB"/>
+          <w14:ligatures w14:val="none"/>
+        </w:rPr>
+      </w:pPr>
+      <w:r>
+        <w:rPr>
+          <w:rFonts w:ascii="Courier New" w:eastAsia="Times New Roman" w:hAnsi="Courier New" w:cs="Courier New"/>
+          <w:kern w:val="0"/>
+          <w:sz w:val="20"/>
+          <w:szCs w:val="20"/>
+          <w:lang w:eastAsia="en-GB"/>
+          <w14:ligatures w14:val="none"/>
+        </w:rPr>
+        <w:t>Experiences</w:t>
+      </w:r>
+    </w:p>
+    <w:p>
+      <w:pPr>
+        <w:tabs>
+          <w:tab w:val="left" w:pos="916"/>
+          <w:tab w:val="left" w:pos="1832"/>
+          <w:tab w:val="left" w:pos="2748"/>
+          <w:tab w:val="left" w:pos="3664"/>
+          <w:tab w:val="left" w:pos="4580"/>
+          <w:tab w:val="left" w:pos="5496"/>
+          <w:tab w:val="left" w:pos="6412"/>
+          <w:tab w:val="left" w:pos="7328"/>
+          <w:tab w:val="left" w:pos="8244"/>
+          <w:tab w:val="left" w:pos="9160"/>
+          <w:tab w:val="left" w:pos="10076"/>
+          <w:tab w:val="left" w:pos="10992"/>
+          <w:tab w:val="left" w:pos="11908"/>
+          <w:tab w:val="left" w:pos="12824"/>
+          <w:tab w:val="left" w:pos="13740"/>
+          <w:tab w:val="left" w:pos="14656"/>
+        </w:tabs>
+        <w:spacing w:after="0" w:line="240" w:lineRule="auto"/>
+        <w:rPr>
+          <w:rFonts w:ascii="Courier New" w:eastAsia="Times New Roman" w:hAnsi="Courier New" w:cs="Courier New"/>
+          <w:kern w:val="0"/>
+          <w:sz w:val="20"/>
+          <w:szCs w:val="20"/>
+          <w:lang w:eastAsia="en-GB"/>
+          <w14:ligatures w14:val="none"/>
+        </w:rPr>
+      </w:pPr>
+      <w:r>
+        <w:rPr>
+          <w:rFonts w:ascii="Courier New" w:eastAsia="Times New Roman" w:hAnsi="Courier New" w:cs="Courier New"/>
+          <w:kern w:val="0"/>
+          <w:sz w:val="20"/>
+          <w:szCs w:val="20"/>
+          <w:lang w:eastAsia="en-GB"/>
+          <w14:ligatures w14:val="none"/>
+        </w:rPr>
+        <w:t>────────────────────────────────</w:t>
+      </w:r>
+    </w:p>
+    <w:p>
+      <w:pPr>
+        <w:tabs>
+          <w:tab w:val="left" w:pos="916"/>
+          <w:tab w:val="left" w:pos="1832"/>
+          <w:tab w:val="left" w:pos="2748"/>
+          <w:tab w:val="left" w:pos="3664"/>
+          <w:tab w:val="left" w:pos="4580"/>
+          <w:tab w:val="left" w:pos="5496"/>
+          <w:tab w:val="left" w:pos="6412"/>
+          <w:tab w:val="left" w:pos="7328"/>
+          <w:tab w:val="left" w:pos="8244"/>
+          <w:tab w:val="left" w:pos="9160"/>
+          <w:tab w:val="left" w:pos="10076"/>
+          <w:tab w:val="left" w:pos="10992"/>
+          <w:tab w:val="left" w:pos="11908"/>
+          <w:tab w:val="left" w:pos="12824"/>
+          <w:tab w:val="left" w:pos="13740"/>
+          <w:tab w:val="left" w:pos="14656"/>
+        </w:tabs>
+        <w:spacing w:after="0" w:line="240" w:lineRule="auto"/>
+        <w:rPr>
+          <w:rFonts w:ascii="Courier New" w:eastAsia="Times New Roman" w:hAnsi="Courier New" w:cs="Courier New"/>
+          <w:kern w:val="0"/>
+          <w:sz w:val="20"/>
+          <w:szCs w:val="20"/>
+          <w:lang w:eastAsia="en-GB"/>
+          <w14:ligatures w14:val="none"/>
+        </w:rPr>
+      </w:pPr>
+      <w:proofErr w:type="gramStart"/>
+      <w:r>
+        <w:rPr>
+          <w:rFonts w:ascii="Courier New" w:eastAsia="Times New Roman" w:hAnsi="Courier New" w:cs="Courier New"/>
+          <w:kern w:val="0"/>
+          <w:sz w:val="20"/>
+          <w:szCs w:val="20"/>
+          <w:lang w:eastAsia="en-GB"/>
+          <w14:ligatures w14:val="none"/>
+        </w:rPr>
+        <w:t>1  Canopy</w:t>
+      </w:r>
+      <w:proofErr w:type="gramEnd"/>
+      <w:r>
+        <w:rPr>
+          <w:rFonts w:ascii="Courier New" w:eastAsia="Times New Roman" w:hAnsi="Courier New" w:cs="Courier New"/>
+          <w:kern w:val="0"/>
+          <w:sz w:val="20"/>
+          <w:szCs w:val="20"/>
+          <w:lang w:eastAsia="en-GB"/>
+          <w14:ligatures w14:val="none"/>
+        </w:rPr>
+        <w:t xml:space="preserve"> Zipline         habitat 1</w:t>
+      </w:r>
+    </w:p>
+    <w:p>
+      <w:pPr>
+        <w:tabs>
+          <w:tab w:val="left" w:pos="916"/>
+          <w:tab w:val="left" w:pos="1832"/>
+          <w:tab w:val="left" w:pos="2748"/>
+          <w:tab w:val="left" w:pos="3664"/>
+          <w:tab w:val="left" w:pos="4580"/>
+          <w:tab w:val="left" w:pos="5496"/>
+          <w:tab w:val="left" w:pos="6412"/>
+          <w:tab w:val="left" w:pos="7328"/>
+          <w:tab w:val="left" w:pos="8244"/>
+          <w:tab w:val="left" w:pos="9160"/>
+          <w:tab w:val="left" w:pos="10076"/>
+          <w:tab w:val="left" w:pos="10992"/>
+          <w:tab w:val="left" w:pos="11908"/>
+          <w:tab w:val="left" w:pos="12824"/>
+          <w:tab w:val="left" w:pos="13740"/>
+          <w:tab w:val="left" w:pos="14656"/>
+        </w:tabs>
+        <w:spacing w:after="0" w:line="240" w:lineRule="auto"/>
+        <w:rPr>
+          <w:rFonts w:ascii="Courier New" w:eastAsia="Times New Roman" w:hAnsi="Courier New" w:cs="Courier New"/>
+          <w:kern w:val="0"/>
+          <w:sz w:val="20"/>
+          <w:szCs w:val="20"/>
+          <w:lang w:eastAsia="en-GB"/>
+          <w14:ligatures w14:val="none"/>
+        </w:rPr>
+      </w:pPr>
+      <w:proofErr w:type="gramStart"/>
+      <w:r>
+        <w:rPr>
+          <w:rFonts w:ascii="Courier New" w:eastAsia="Times New Roman" w:hAnsi="Courier New" w:cs="Courier New"/>
+          <w:kern w:val="0"/>
+          <w:sz w:val="20"/>
+          <w:szCs w:val="20"/>
+          <w:lang w:eastAsia="en-GB"/>
+          <w14:ligatures w14:val="none"/>
+        </w:rPr>
+        <w:t>2  Sloth</w:t>
+      </w:r>
+      <w:proofErr w:type="gramEnd"/>
+      <w:r>
+        <w:rPr>
+          <w:rFonts w:ascii="Courier New" w:eastAsia="Times New Roman" w:hAnsi="Courier New" w:cs="Courier New"/>
+          <w:kern w:val="0"/>
+          <w:sz w:val="20"/>
+          <w:szCs w:val="20"/>
+          <w:lang w:eastAsia="en-GB"/>
+          <w14:ligatures w14:val="none"/>
+        </w:rPr>
+        <w:t xml:space="preserve"> Sanctuary       habitat 1</w:t>
+      </w:r>
+    </w:p>
+    <w:p>
+      <w:pPr>
+        <w:tabs>
+          <w:tab w:val="left" w:pos="916"/>
+          <w:tab w:val="left" w:pos="1832"/>
+          <w:tab w:val="left" w:pos="2748"/>
+          <w:tab w:val="left" w:pos="3664"/>
+          <w:tab w:val="left" w:pos="4580"/>
+          <w:tab w:val="left" w:pos="5496"/>
+          <w:tab w:val="left" w:pos="6412"/>
+          <w:tab w:val="left" w:pos="7328"/>
+          <w:tab w:val="left" w:pos="8244"/>
+          <w:tab w:val="left" w:pos="9160"/>
+          <w:tab w:val="left" w:pos="10076"/>
+          <w:tab w:val="left" w:pos="10992"/>
+          <w:tab w:val="left" w:pos="11908"/>
+          <w:tab w:val="left" w:pos="12824"/>
+          <w:tab w:val="left" w:pos="13740"/>
+          <w:tab w:val="left" w:pos="14656"/>
+        </w:tabs>
+        <w:spacing w:after="0" w:line="240" w:lineRule="auto"/>
+        <w:rPr>
+          <w:rFonts w:ascii="Courier New" w:eastAsia="Times New Roman" w:hAnsi="Courier New" w:cs="Courier New"/>
+          <w:kern w:val="0"/>
+          <w:sz w:val="20"/>
+          <w:szCs w:val="20"/>
+          <w:lang w:eastAsia="en-GB"/>
+          <w14:ligatures w14:val="none"/>
+        </w:rPr>
+      </w:pPr>
+      <w:proofErr w:type="gramStart"/>
+      <w:r>
+        <w:rPr>
+          <w:rFonts w:ascii="Courier New" w:eastAsia="Times New Roman" w:hAnsi="Courier New" w:cs="Courier New"/>
+          <w:kern w:val="0"/>
+          <w:sz w:val="20"/>
+          <w:szCs w:val="20"/>
+          <w:lang w:eastAsia="en-GB"/>
+          <w14:ligatures w14:val="none"/>
+        </w:rPr>
+        <w:t>3  Macaw</w:t>
+      </w:r>
+      <w:proofErr w:type="gramEnd"/>
+      <w:r>
+        <w:rPr>
+          <w:rFonts w:ascii="Courier New" w:eastAsia="Times New Roman" w:hAnsi="Courier New" w:cs="Courier New"/>
+          <w:kern w:val="0"/>
+          <w:sz w:val="20"/>
+          <w:szCs w:val="20"/>
+          <w:lang w:eastAsia="en-GB"/>
+          <w14:ligatures w14:val="none"/>
+        </w:rPr>
+        <w:t xml:space="preserve"> Flight          habitat 1</w:t>
+      </w:r>
+    </w:p>
+    <w:p>
+      <w:pPr>
+        <w:tabs>
+          <w:tab w:val="left" w:pos="916"/>
+          <w:tab w:val="left" w:pos="1832"/>
+          <w:tab w:val="left" w:pos="2748"/>
+          <w:tab w:val="left" w:pos="3664"/>
+          <w:tab w:val="left" w:pos="4580"/>
+          <w:tab w:val="left" w:pos="5496"/>
+          <w:tab w:val="left" w:pos="6412"/>
+          <w:tab w:val="left" w:pos="7328"/>
+          <w:tab w:val="left" w:pos="8244"/>
+          <w:tab w:val="left" w:pos="9160"/>
+          <w:tab w:val="left" w:pos="10076"/>
+          <w:tab w:val="left" w:pos="10992"/>
+          <w:tab w:val="left" w:pos="11908"/>
+          <w:tab w:val="left" w:pos="12824"/>
+          <w:tab w:val="left" w:pos="13740"/>
+          <w:tab w:val="left" w:pos="14656"/>
+        </w:tabs>
+        <w:spacing w:after="0" w:line="240" w:lineRule="auto"/>
+        <w:rPr>
+          <w:rFonts w:ascii="Courier New" w:eastAsia="Times New Roman" w:hAnsi="Courier New" w:cs="Courier New"/>
+          <w:kern w:val="0"/>
+          <w:sz w:val="20"/>
+          <w:szCs w:val="20"/>
+          <w:lang w:eastAsia="en-GB"/>
+          <w14:ligatures w14:val="none"/>
+        </w:rPr>
+      </w:pPr>
+      <w:proofErr w:type="gramStart"/>
+      <w:r>
+        <w:rPr>
+          <w:rFonts w:ascii="Courier New" w:eastAsia="Times New Roman" w:hAnsi="Courier New" w:cs="Courier New"/>
+          <w:kern w:val="0"/>
+          <w:sz w:val="20"/>
+          <w:szCs w:val="20"/>
+          <w:lang w:eastAsia="en-GB"/>
+          <w14:ligatures w14:val="none"/>
+        </w:rPr>
+        <w:t>4  Elephant</w:t>
+      </w:r>
+      <w:proofErr w:type="gramEnd"/>
+      <w:r>
+        <w:rPr>
+          <w:rFonts w:ascii="Courier New" w:eastAsia="Times New Roman" w:hAnsi="Courier New" w:cs="Courier New"/>
+          <w:kern w:val="0"/>
+          <w:sz w:val="20"/>
+          <w:szCs w:val="20"/>
+          <w:lang w:eastAsia="en-GB"/>
+          <w14:ligatures w14:val="none"/>
+        </w:rPr>
+        <w:t xml:space="preserve"> Feeding      habitat 2</w:t>
+      </w:r>
+    </w:p>
+    <w:p>
+      <w:pPr>
+        <w:spacing w:before="100" w:beforeAutospacing="1" w:after="100" w:afterAutospacing="1" w:line="240" w:lineRule="auto"/>
+        <w:rPr>
+          <w:rFonts w:ascii="Times New Roman" w:eastAsia="Times New Roman" w:hAnsi="Times New Roman" w:cs="Times New Roman"/>
+          <w:kern w:val="0"/>
+          <w:lang w:eastAsia="en-GB"/>
+          <w14:ligatures w14:val="none"/>
+        </w:rPr>
+      </w:pPr>
+      <w:r>
+        <w:rPr>
+          <w:rFonts w:ascii="Times New Roman" w:eastAsia="Times New Roman" w:hAnsi="Times New Roman" w:cs="Times New Roman"/>
+          <w:kern w:val="0"/>
+          <w:lang w:eastAsia="en-GB"/>
+          <w14:ligatures w14:val="none"/>
+        </w:rPr>
+        <w:t xml:space="preserve">This creates a clear </w:t>
+      </w:r>
+      <w:r>
+        <w:rPr>
+          <w:rFonts w:ascii="Times New Roman" w:eastAsia="Times New Roman" w:hAnsi="Times New Roman" w:cs="Times New Roman"/>
+          <w:b/>
+          <w:bCs/>
+          <w:kern w:val="0"/>
+          <w:lang w:eastAsia="en-GB"/>
+          <w14:ligatures w14:val="none"/>
+        </w:rPr>
+        <w:t>one-to-many relationship</w:t>
+      </w:r>
+      <w:r>
+        <w:rPr>
+          <w:rFonts w:ascii="Times New Roman" w:eastAsia="Times New Roman" w:hAnsi="Times New Roman" w:cs="Times New Roman"/>
+          <w:kern w:val="0"/>
+          <w:lang w:eastAsia="en-GB"/>
+          <w14:ligatures w14:val="none"/>
+        </w:rPr>
+        <w:t>:</w:t>
+      </w:r>
+    </w:p>
+    <w:p>
+      <w:pPr>
+        <w:tabs>
+          <w:tab w:val="left" w:pos="916"/>
+          <w:tab w:val="left" w:pos="1832"/>
+          <w:tab w:val="left" w:pos="2748"/>
+          <w:tab w:val="left" w:pos="3664"/>
+          <w:tab w:val="left" w:pos="4580"/>
+          <w:tab w:val="left" w:pos="5496"/>
+          <w:tab w:val="left" w:pos="6412"/>
+          <w:tab w:val="left" w:pos="7328"/>
+          <w:tab w:val="left" w:pos="8244"/>
+          <w:tab w:val="left" w:pos="9160"/>
+          <w:tab w:val="left" w:pos="10076"/>
+          <w:tab w:val="left" w:pos="10992"/>
+          <w:tab w:val="left" w:pos="11908"/>
+          <w:tab w:val="left" w:pos="12824"/>
+          <w:tab w:val="left" w:pos="13740"/>
+          <w:tab w:val="left" w:pos="14656"/>
+        </w:tabs>
+        <w:spacing w:after="0" w:line="240" w:lineRule="auto"/>
+        <w:rPr>
+          <w:rFonts w:ascii="Courier New" w:eastAsia="Times New Roman" w:hAnsi="Courier New" w:cs="Courier New"/>
+          <w:kern w:val="0"/>
+          <w:sz w:val="20"/>
+          <w:szCs w:val="20"/>
+          <w:lang w:eastAsia="en-GB"/>
+          <w14:ligatures w14:val="none"/>
+        </w:rPr>
+      </w:pPr>
+      <w:r>
+        <w:rPr>
+          <w:rFonts w:ascii="Courier New" w:eastAsia="Times New Roman" w:hAnsi="Courier New" w:cs="Courier New"/>
+          <w:kern w:val="0"/>
+          <w:sz w:val="20"/>
+          <w:szCs w:val="20"/>
+          <w:lang w:eastAsia="en-GB"/>
+          <w14:ligatures w14:val="none"/>
+        </w:rPr>
+        <w:t>One Habitat ───────&lt; Many Experiences</w:t>
+      </w:r>
+    </w:p>
+    <w:p>
+      <w:pPr>
+        <w:rPr>
+          <w:rFonts w:ascii="Courier New" w:eastAsia="Times New Roman" w:hAnsi="Courier New" w:cs="Courier New"/>
+          <w:kern w:val="0"/>
+          <w:sz w:val="20"/>
+          <w:szCs w:val="20"/>
+          <w:lang w:eastAsia="en-GB"/>
+          <w14:ligatures w14:val="none"/>
+        </w:rPr>
+      </w:pPr>
+      <w:r>
+        <w:br w:type="page"/>
+      </w:r>
+    </w:p>
+    <w:p>
+      <w:pPr>
+        <w:spacing w:before="100" w:beforeAutospacing="1" w:after="100" w:afterAutospacing="1" w:line="240" w:lineRule="auto"/>
+        <w:outlineLvl w:val="1"/>
+        <w:rPr>
+          <w:rFonts w:ascii="Times New Roman" w:eastAsia="Times New Roman" w:hAnsi="Times New Roman" w:cs="Times New Roman"/>
+          <w:b/>
+          <w:bCs/>
+          <w:kern w:val="0"/>
+          <w:sz w:val="36"/>
+          <w:szCs w:val="36"/>
+          <w:lang w:eastAsia="en-GB"/>
+          <w14:ligatures w14:val="none"/>
+        </w:rPr>
+      </w:pPr>
+      <w:r>
+        <w:rPr>
+          <w:rFonts w:ascii="Times New Roman" w:eastAsia="Times New Roman" w:hAnsi="Times New Roman" w:cs="Times New Roman"/>
+          <w:b/>
+          <w:bCs/>
+          <w:kern w:val="0"/>
+          <w:sz w:val="36"/>
+          <w:szCs w:val="36"/>
+          <w:lang w:eastAsia="en-GB"/>
+          <w14:ligatures w14:val="none"/>
+        </w:rPr>
+        <w:lastRenderedPageBreak/>
+        <w:t>Suggested schema</w:t>
+      </w:r>
+    </w:p>
+    <w:p>
+      <w:pPr>
+        <w:spacing w:before="100" w:beforeAutospacing="1" w:after="100" w:afterAutospacing="1" w:line="240" w:lineRule="auto"/>
+        <w:outlineLvl w:val="2"/>
+        <w:rPr>
+          <w:rFonts w:ascii="Times New Roman" w:eastAsia="Times New Roman" w:hAnsi="Times New Roman" w:cs="Times New Roman"/>
+          <w:b/>
+          <w:bCs/>
+          <w:kern w:val="0"/>
+          <w:sz w:val="27"/>
+          <w:szCs w:val="27"/>
+          <w:lang w:eastAsia="en-GB"/>
+          <w14:ligatures w14:val="none"/>
+        </w:rPr>
+      </w:pPr>
+      <w:r>
+        <w:rPr>
+          <w:rFonts w:ascii="Courier New" w:eastAsia="Times New Roman" w:hAnsi="Courier New" w:cs="Courier New"/>
+          <w:b/>
+          <w:bCs/>
+          <w:kern w:val="0"/>
+          <w:sz w:val="20"/>
+          <w:szCs w:val="20"/>
+          <w:lang w:eastAsia="en-GB"/>
+          <w14:ligatures w14:val="none"/>
+        </w:rPr>
+        <w:t>habitats</w:t>
+      </w:r>
+    </w:p>
+    <w:tbl>
+      <w:tblPr>
+        <w:tblW w:w="0" w:type="auto"/>
+        <w:tblCellSpacing w:w="15" w:type="dxa"/>
+        <w:tblCellMar>
+          <w:top w:w="15" w:type="dxa"/>
+          <w:left w:w="15" w:type="dxa"/>
+          <w:bottom w:w="15" w:type="dxa"/>
+          <w:right w:w="15" w:type="dxa"/>
+        </w:tblCellMar>
+        <w:tblLook w:val="04A0" w:firstRow="1" w:lastRow="0" w:firstColumn="1" w:lastColumn="0" w:noHBand="0" w:noVBand="1"/>
+      </w:tblPr>
+      <w:tblGrid>
+        <w:gridCol w:w="1396"/>
+        <w:gridCol w:w="2015"/>
+      </w:tblGrid>
+      <w:tr>
+        <w:trPr>
+          <w:tblHeader/>
+          <w:tblCellSpacing w:w="15" w:type="dxa"/>
+        </w:trPr>
+        <w:tc>
+          <w:tcPr>
+            <w:tcW w:w="0" w:type="auto"/>
+            <w:vAlign w:val="center"/>
+            <w:hideMark/>
+          </w:tcPr>
+          <w:p>
+            <w:pPr>
+              <w:spacing w:after="0" w:line="240" w:lineRule="auto"/>
+              <w:jc w:val="center"/>
+              <w:rPr>
+                <w:rFonts w:ascii="Times New Roman" w:eastAsia="Times New Roman" w:hAnsi="Times New Roman" w:cs="Times New Roman"/>
+                <w:b/>
+                <w:bCs/>
+                <w:kern w:val="0"/>
+                <w:lang w:eastAsia="en-GB"/>
+                <w14:ligatures w14:val="none"/>
+              </w:rPr>
+            </w:pPr>
+            <w:r>
+              <w:rPr>
+                <w:rFonts w:ascii="Times New Roman" w:eastAsia="Times New Roman" w:hAnsi="Times New Roman" w:cs="Times New Roman"/>
+                <w:b/>
+                <w:bCs/>
+                <w:kern w:val="0"/>
+                <w:lang w:eastAsia="en-GB"/>
+                <w14:ligatures w14:val="none"/>
+              </w:rPr>
+              <w:t>Column</w:t>
+            </w:r>
+          </w:p>
+        </w:tc>
+        <w:tc>
+          <w:tcPr>
+            <w:tcW w:w="0" w:type="auto"/>
+            <w:vAlign w:val="center"/>
+            <w:hideMark/>
+          </w:tcPr>
+          <w:p>
+            <w:pPr>
+              <w:spacing w:after="0" w:line="240" w:lineRule="auto"/>
+              <w:jc w:val="center"/>
+              <w:rPr>
+                <w:rFonts w:ascii="Times New Roman" w:eastAsia="Times New Roman" w:hAnsi="Times New Roman" w:cs="Times New Roman"/>
+                <w:b/>
+                <w:bCs/>
+                <w:kern w:val="0"/>
+                <w:lang w:eastAsia="en-GB"/>
+                <w14:ligatures w14:val="none"/>
+              </w:rPr>
+            </w:pPr>
+            <w:r>
+              <w:rPr>
+                <w:rFonts w:ascii="Times New Roman" w:eastAsia="Times New Roman" w:hAnsi="Times New Roman" w:cs="Times New Roman"/>
+                <w:b/>
+                <w:bCs/>
+                <w:kern w:val="0"/>
+                <w:lang w:eastAsia="en-GB"/>
+                <w14:ligatures w14:val="none"/>
+              </w:rPr>
+              <w:t>Purpose</w:t>
+            </w:r>
+          </w:p>
+        </w:tc>
+      </w:tr>
+      <w:tr>
+        <w:trPr>
+          <w:tblCellSpacing w:w="15" w:type="dxa"/>
+        </w:trPr>
+        <w:tc>
+          <w:tcPr>
+            <w:tcW w:w="0" w:type="auto"/>
+            <w:vAlign w:val="center"/>
+            <w:hideMark/>
+          </w:tcPr>
+          <w:p>
+            <w:pPr>
+              <w:spacing w:after="0" w:line="240" w:lineRule="auto"/>
+              <w:rPr>
+                <w:rFonts w:ascii="Times New Roman" w:eastAsia="Times New Roman" w:hAnsi="Times New Roman" w:cs="Times New Roman"/>
+                <w:kern w:val="0"/>
+                <w:lang w:eastAsia="en-GB"/>
+                <w14:ligatures w14:val="none"/>
+              </w:rPr>
+            </w:pPr>
+            <w:proofErr w:type="spellStart"/>
+            <w:r>
+              <w:rPr>
+                <w:rFonts w:ascii="Courier New" w:eastAsia="Times New Roman" w:hAnsi="Courier New" w:cs="Courier New"/>
+                <w:kern w:val="0"/>
+                <w:sz w:val="20"/>
+                <w:szCs w:val="20"/>
+                <w:lang w:eastAsia="en-GB"/>
+                <w14:ligatures w14:val="none"/>
+              </w:rPr>
+              <w:t>habitat_id</w:t>
+            </w:r>
+            <w:proofErr w:type="spellEnd"/>
+          </w:p>
+        </w:tc>
+        <w:tc>
+          <w:tcPr>
+            <w:tcW w:w="0" w:type="auto"/>
+            <w:vAlign w:val="center"/>
+            <w:hideMark/>
+          </w:tcPr>
+          <w:p>
+            <w:pPr>
+              <w:spacing w:after="0" w:line="240" w:lineRule="auto"/>
+              <w:rPr>
+                <w:rFonts w:ascii="Times New Roman" w:eastAsia="Times New Roman" w:hAnsi="Times New Roman" w:cs="Times New Roman"/>
+                <w:kern w:val="0"/>
+                <w:lang w:eastAsia="en-GB"/>
+                <w14:ligatures w14:val="none"/>
+              </w:rPr>
+            </w:pPr>
+            <w:r>
+              <w:rPr>
+                <w:rFonts w:ascii="Times New Roman" w:eastAsia="Times New Roman" w:hAnsi="Times New Roman" w:cs="Times New Roman"/>
+                <w:kern w:val="0"/>
+                <w:lang w:eastAsia="en-GB"/>
+                <w14:ligatures w14:val="none"/>
+              </w:rPr>
+              <w:t>Primary key</w:t>
+            </w:r>
+          </w:p>
+        </w:tc>
+      </w:tr>
+      <w:tr>
+        <w:trPr>
+          <w:tblCellSpacing w:w="15" w:type="dxa"/>
+        </w:trPr>
+        <w:tc>
+          <w:tcPr>
+            <w:tcW w:w="0" w:type="auto"/>
+            <w:vAlign w:val="center"/>
+            <w:hideMark/>
+          </w:tcPr>
+          <w:p>
+            <w:pPr>
+              <w:spacing w:after="0" w:line="240" w:lineRule="auto"/>
+              <w:rPr>
+                <w:rFonts w:ascii="Times New Roman" w:eastAsia="Times New Roman" w:hAnsi="Times New Roman" w:cs="Times New Roman"/>
+                <w:kern w:val="0"/>
+                <w:lang w:eastAsia="en-GB"/>
+                <w14:ligatures w14:val="none"/>
+              </w:rPr>
+            </w:pPr>
+            <w:r>
+              <w:rPr>
+                <w:rFonts w:ascii="Courier New" w:eastAsia="Times New Roman" w:hAnsi="Courier New" w:cs="Courier New"/>
+                <w:kern w:val="0"/>
+                <w:sz w:val="20"/>
+                <w:szCs w:val="20"/>
+                <w:lang w:eastAsia="en-GB"/>
+                <w14:ligatures w14:val="none"/>
+              </w:rPr>
+              <w:t>name</w:t>
+            </w:r>
+          </w:p>
+        </w:tc>
+        <w:tc>
+          <w:tcPr>
+            <w:tcW w:w="0" w:type="auto"/>
+            <w:vAlign w:val="center"/>
+            <w:hideMark/>
+          </w:tcPr>
+          <w:p>
+            <w:pPr>
+              <w:spacing w:after="0" w:line="240" w:lineRule="auto"/>
+              <w:rPr>
+                <w:rFonts w:ascii="Times New Roman" w:eastAsia="Times New Roman" w:hAnsi="Times New Roman" w:cs="Times New Roman"/>
+                <w:kern w:val="0"/>
+                <w:lang w:eastAsia="en-GB"/>
+                <w14:ligatures w14:val="none"/>
+              </w:rPr>
+            </w:pPr>
+            <w:r>
+              <w:rPr>
+                <w:rFonts w:ascii="Times New Roman" w:eastAsia="Times New Roman" w:hAnsi="Times New Roman" w:cs="Times New Roman"/>
+                <w:kern w:val="0"/>
+                <w:lang w:eastAsia="en-GB"/>
+                <w14:ligatures w14:val="none"/>
+              </w:rPr>
+              <w:t>Habitat name</w:t>
+            </w:r>
+          </w:p>
+        </w:tc>
+      </w:tr>
+      <w:tr>
+        <w:trPr>
+          <w:tblCellSpacing w:w="15" w:type="dxa"/>
+        </w:trPr>
+        <w:tc>
+          <w:tcPr>
+            <w:tcW w:w="0" w:type="auto"/>
+            <w:vAlign w:val="center"/>
+            <w:hideMark/>
+          </w:tcPr>
+          <w:p>
+            <w:pPr>
+              <w:spacing w:after="0" w:line="240" w:lineRule="auto"/>
+              <w:rPr>
+                <w:rFonts w:ascii="Times New Roman" w:eastAsia="Times New Roman" w:hAnsi="Times New Roman" w:cs="Times New Roman"/>
+                <w:kern w:val="0"/>
+                <w:lang w:eastAsia="en-GB"/>
+                <w14:ligatures w14:val="none"/>
+              </w:rPr>
+            </w:pPr>
+            <w:r>
+              <w:rPr>
+                <w:rFonts w:ascii="Courier New" w:eastAsia="Times New Roman" w:hAnsi="Courier New" w:cs="Courier New"/>
+                <w:kern w:val="0"/>
+                <w:sz w:val="20"/>
+                <w:szCs w:val="20"/>
+                <w:lang w:eastAsia="en-GB"/>
+                <w14:ligatures w14:val="none"/>
+              </w:rPr>
+              <w:t>description</w:t>
+            </w:r>
+          </w:p>
+        </w:tc>
+        <w:tc>
+          <w:tcPr>
+            <w:tcW w:w="0" w:type="auto"/>
+            <w:vAlign w:val="center"/>
+            <w:hideMark/>
+          </w:tcPr>
+          <w:p>
+            <w:pPr>
+              <w:spacing w:after="0" w:line="240" w:lineRule="auto"/>
+              <w:rPr>
+                <w:rFonts w:ascii="Times New Roman" w:eastAsia="Times New Roman" w:hAnsi="Times New Roman" w:cs="Times New Roman"/>
+                <w:kern w:val="0"/>
+                <w:lang w:eastAsia="en-GB"/>
+                <w14:ligatures w14:val="none"/>
+              </w:rPr>
+            </w:pPr>
+            <w:r>
+              <w:rPr>
+                <w:rFonts w:ascii="Times New Roman" w:eastAsia="Times New Roman" w:hAnsi="Times New Roman" w:cs="Times New Roman"/>
+                <w:kern w:val="0"/>
+                <w:lang w:eastAsia="en-GB"/>
+                <w14:ligatures w14:val="none"/>
+              </w:rPr>
+              <w:t>Habitat introduction</w:t>
+            </w:r>
+          </w:p>
+        </w:tc>
+      </w:tr>
+      <w:tr>
+        <w:trPr>
+          <w:tblCellSpacing w:w="15" w:type="dxa"/>
+        </w:trPr>
+        <w:tc>
+          <w:tcPr>
+            <w:tcW w:w="0" w:type="auto"/>
+            <w:vAlign w:val="center"/>
+            <w:hideMark/>
+          </w:tcPr>
+          <w:p>
+            <w:pPr>
+              <w:spacing w:after="0" w:line="240" w:lineRule="auto"/>
+              <w:rPr>
+                <w:rFonts w:ascii="Times New Roman" w:eastAsia="Times New Roman" w:hAnsi="Times New Roman" w:cs="Times New Roman"/>
+                <w:kern w:val="0"/>
+                <w:lang w:eastAsia="en-GB"/>
+                <w14:ligatures w14:val="none"/>
+              </w:rPr>
+            </w:pPr>
+            <w:proofErr w:type="spellStart"/>
+            <w:r>
+              <w:rPr>
+                <w:rFonts w:ascii="Courier New" w:eastAsia="Times New Roman" w:hAnsi="Courier New" w:cs="Courier New"/>
+                <w:kern w:val="0"/>
+                <w:sz w:val="20"/>
+                <w:szCs w:val="20"/>
+                <w:lang w:eastAsia="en-GB"/>
+                <w14:ligatures w14:val="none"/>
+              </w:rPr>
+              <w:t>video_path</w:t>
+            </w:r>
+            <w:proofErr w:type="spellEnd"/>
+          </w:p>
+        </w:tc>
+        <w:tc>
+          <w:tcPr>
+            <w:tcW w:w="0" w:type="auto"/>
+            <w:vAlign w:val="center"/>
+            <w:hideMark/>
+          </w:tcPr>
+          <w:p>
+            <w:pPr>
+              <w:spacing w:after="0" w:line="240" w:lineRule="auto"/>
+              <w:rPr>
+                <w:rFonts w:ascii="Times New Roman" w:eastAsia="Times New Roman" w:hAnsi="Times New Roman" w:cs="Times New Roman"/>
+                <w:kern w:val="0"/>
+                <w:lang w:eastAsia="en-GB"/>
+                <w14:ligatures w14:val="none"/>
+              </w:rPr>
+            </w:pPr>
+            <w:r>
+              <w:rPr>
+                <w:rFonts w:ascii="Times New Roman" w:eastAsia="Times New Roman" w:hAnsi="Times New Roman" w:cs="Times New Roman"/>
+                <w:kern w:val="0"/>
+                <w:lang w:eastAsia="en-GB"/>
+                <w14:ligatures w14:val="none"/>
+              </w:rPr>
+              <w:t>Background video</w:t>
+            </w:r>
+          </w:p>
+        </w:tc>
+      </w:tr>
+      <w:tr>
+        <w:trPr>
+          <w:tblCellSpacing w:w="15" w:type="dxa"/>
+        </w:trPr>
+        <w:tc>
+          <w:tcPr>
+            <w:tcW w:w="0" w:type="auto"/>
+            <w:vAlign w:val="center"/>
+            <w:hideMark/>
+          </w:tcPr>
+          <w:p>
+            <w:pPr>
+              <w:spacing w:after="0" w:line="240" w:lineRule="auto"/>
+              <w:rPr>
+                <w:rFonts w:ascii="Times New Roman" w:eastAsia="Times New Roman" w:hAnsi="Times New Roman" w:cs="Times New Roman"/>
+                <w:kern w:val="0"/>
+                <w:lang w:eastAsia="en-GB"/>
+                <w14:ligatures w14:val="none"/>
+              </w:rPr>
+            </w:pPr>
+            <w:r>
+              <w:rPr>
+                <w:rFonts w:ascii="Courier New" w:eastAsia="Times New Roman" w:hAnsi="Courier New" w:cs="Courier New"/>
+                <w:kern w:val="0"/>
+                <w:sz w:val="20"/>
+                <w:szCs w:val="20"/>
+                <w:lang w:eastAsia="en-GB"/>
+                <w14:ligatures w14:val="none"/>
+              </w:rPr>
+              <w:t>route</w:t>
+            </w:r>
+          </w:p>
+        </w:tc>
+        <w:tc>
+          <w:tcPr>
+            <w:tcW w:w="0" w:type="auto"/>
+            <w:vAlign w:val="center"/>
+            <w:hideMark/>
+          </w:tcPr>
+          <w:p>
+            <w:pPr>
+              <w:spacing w:after="0" w:line="240" w:lineRule="auto"/>
+              <w:rPr>
+                <w:rFonts w:ascii="Times New Roman" w:eastAsia="Times New Roman" w:hAnsi="Times New Roman" w:cs="Times New Roman"/>
+                <w:kern w:val="0"/>
+                <w:lang w:eastAsia="en-GB"/>
+                <w14:ligatures w14:val="none"/>
+              </w:rPr>
+            </w:pPr>
+            <w:r>
+              <w:rPr>
+                <w:rFonts w:ascii="Times New Roman" w:eastAsia="Times New Roman" w:hAnsi="Times New Roman" w:cs="Times New Roman"/>
+                <w:kern w:val="0"/>
+                <w:lang w:eastAsia="en-GB"/>
+                <w14:ligatures w14:val="none"/>
+              </w:rPr>
+              <w:t>Express route</w:t>
+            </w:r>
+          </w:p>
+        </w:tc>
+      </w:tr>
+    </w:tbl>
+    <w:p>
+      <w:pPr>
+        <w:spacing w:before="100" w:beforeAutospacing="1" w:after="100" w:afterAutospacing="1" w:line="240" w:lineRule="auto"/>
+        <w:outlineLvl w:val="2"/>
+        <w:rPr>
+          <w:rFonts w:ascii="Times New Roman" w:eastAsia="Times New Roman" w:hAnsi="Times New Roman" w:cs="Times New Roman"/>
+          <w:b/>
+          <w:bCs/>
+          <w:kern w:val="0"/>
+          <w:sz w:val="27"/>
+          <w:szCs w:val="27"/>
+          <w:lang w:eastAsia="en-GB"/>
+          <w14:ligatures w14:val="none"/>
+        </w:rPr>
+      </w:pPr>
+      <w:r>
+        <w:rPr>
+          <w:rFonts w:ascii="Courier New" w:eastAsia="Times New Roman" w:hAnsi="Courier New" w:cs="Courier New"/>
+          <w:b/>
+          <w:bCs/>
+          <w:kern w:val="0"/>
+          <w:sz w:val="20"/>
+          <w:szCs w:val="20"/>
+          <w:lang w:eastAsia="en-GB"/>
+          <w14:ligatures w14:val="none"/>
+        </w:rPr>
+        <w:t>experiences</w:t>
+      </w:r>
+    </w:p>
+    <w:tbl>
+      <w:tblPr>
+        <w:tblW w:w="0" w:type="auto"/>
+        <w:tblCellSpacing w:w="15" w:type="dxa"/>
+        <w:tblCellMar>
+          <w:top w:w="15" w:type="dxa"/>
+          <w:left w:w="15" w:type="dxa"/>
+          <w:bottom w:w="15" w:type="dxa"/>
+          <w:right w:w="15" w:type="dxa"/>
+        </w:tblCellMar>
+        <w:tblLook w:val="04A0" w:firstRow="1" w:lastRow="0" w:firstColumn="1" w:lastColumn="0" w:noHBand="0" w:noVBand="1"/>
+      </w:tblPr>
+      <w:tblGrid>
+        <w:gridCol w:w="1636"/>
+        <w:gridCol w:w="2108"/>
+      </w:tblGrid>
+      <w:tr>
+        <w:trPr>
+          <w:tblHeader/>
+          <w:tblCellSpacing w:w="15" w:type="dxa"/>
+        </w:trPr>
+        <w:tc>
+          <w:tcPr>
+            <w:tcW w:w="0" w:type="auto"/>
+            <w:vAlign w:val="center"/>
+            <w:hideMark/>
+          </w:tcPr>
+          <w:p>
+            <w:pPr>
+              <w:spacing w:after="0" w:line="240" w:lineRule="auto"/>
+              <w:jc w:val="center"/>
+              <w:rPr>
+                <w:rFonts w:ascii="Times New Roman" w:eastAsia="Times New Roman" w:hAnsi="Times New Roman" w:cs="Times New Roman"/>
+                <w:b/>
+                <w:bCs/>
+                <w:kern w:val="0"/>
+                <w:lang w:eastAsia="en-GB"/>
+                <w14:ligatures w14:val="none"/>
+              </w:rPr>
+            </w:pPr>
+            <w:r>
+              <w:rPr>
+                <w:rFonts w:ascii="Times New Roman" w:eastAsia="Times New Roman" w:hAnsi="Times New Roman" w:cs="Times New Roman"/>
+                <w:b/>
+                <w:bCs/>
+                <w:kern w:val="0"/>
+                <w:lang w:eastAsia="en-GB"/>
+                <w14:ligatures w14:val="none"/>
+              </w:rPr>
+              <w:t>Column</w:t>
+            </w:r>
+          </w:p>
+        </w:tc>
+        <w:tc>
+          <w:tcPr>
+            <w:tcW w:w="0" w:type="auto"/>
+            <w:vAlign w:val="center"/>
+            <w:hideMark/>
+          </w:tcPr>
+          <w:p>
+            <w:pPr>
+              <w:spacing w:after="0" w:line="240" w:lineRule="auto"/>
+              <w:jc w:val="center"/>
+              <w:rPr>
+                <w:rFonts w:ascii="Times New Roman" w:eastAsia="Times New Roman" w:hAnsi="Times New Roman" w:cs="Times New Roman"/>
+                <w:b/>
+                <w:bCs/>
+                <w:kern w:val="0"/>
+                <w:lang w:eastAsia="en-GB"/>
+                <w14:ligatures w14:val="none"/>
+              </w:rPr>
+            </w:pPr>
+            <w:r>
+              <w:rPr>
+                <w:rFonts w:ascii="Times New Roman" w:eastAsia="Times New Roman" w:hAnsi="Times New Roman" w:cs="Times New Roman"/>
+                <w:b/>
+                <w:bCs/>
+                <w:kern w:val="0"/>
+                <w:lang w:eastAsia="en-GB"/>
+                <w14:ligatures w14:val="none"/>
+              </w:rPr>
+              <w:t>Purpose</w:t>
+            </w:r>
+          </w:p>
+        </w:tc>
+      </w:tr>
+      <w:tr>
+        <w:trPr>
+          <w:tblCellSpacing w:w="15" w:type="dxa"/>
+        </w:trPr>
+        <w:tc>
+          <w:tcPr>
+            <w:tcW w:w="0" w:type="auto"/>
+            <w:vAlign w:val="center"/>
+            <w:hideMark/>
+          </w:tcPr>
+          <w:p>
+            <w:pPr>
+              <w:spacing w:after="0" w:line="240" w:lineRule="auto"/>
+              <w:rPr>
+                <w:rFonts w:ascii="Times New Roman" w:eastAsia="Times New Roman" w:hAnsi="Times New Roman" w:cs="Times New Roman"/>
+                <w:kern w:val="0"/>
+                <w:lang w:eastAsia="en-GB"/>
+                <w14:ligatures w14:val="none"/>
+              </w:rPr>
+            </w:pPr>
+            <w:proofErr w:type="spellStart"/>
+            <w:r>
+              <w:rPr>
+                <w:rFonts w:ascii="Courier New" w:eastAsia="Times New Roman" w:hAnsi="Courier New" w:cs="Courier New"/>
+                <w:kern w:val="0"/>
+                <w:sz w:val="20"/>
+                <w:szCs w:val="20"/>
+                <w:lang w:eastAsia="en-GB"/>
+                <w14:ligatures w14:val="none"/>
+              </w:rPr>
+              <w:t>experience_id</w:t>
+            </w:r>
+            <w:proofErr w:type="spellEnd"/>
+          </w:p>
+        </w:tc>
+        <w:tc>
+          <w:tcPr>
+            <w:tcW w:w="0" w:type="auto"/>
+            <w:vAlign w:val="center"/>
+            <w:hideMark/>
+          </w:tcPr>
+          <w:p>
+            <w:pPr>
+              <w:spacing w:after="0" w:line="240" w:lineRule="auto"/>
+              <w:rPr>
+                <w:rFonts w:ascii="Times New Roman" w:eastAsia="Times New Roman" w:hAnsi="Times New Roman" w:cs="Times New Roman"/>
+                <w:kern w:val="0"/>
+                <w:lang w:eastAsia="en-GB"/>
+                <w14:ligatures w14:val="none"/>
+              </w:rPr>
+            </w:pPr>
+            <w:r>
+              <w:rPr>
+                <w:rFonts w:ascii="Times New Roman" w:eastAsia="Times New Roman" w:hAnsi="Times New Roman" w:cs="Times New Roman"/>
+                <w:kern w:val="0"/>
+                <w:lang w:eastAsia="en-GB"/>
+                <w14:ligatures w14:val="none"/>
+              </w:rPr>
+              <w:t>Primary key</w:t>
+            </w:r>
+          </w:p>
+        </w:tc>
+      </w:tr>
+      <w:tr>
+        <w:trPr>
+          <w:tblCellSpacing w:w="15" w:type="dxa"/>
+        </w:trPr>
+        <w:tc>
+          <w:tcPr>
+            <w:tcW w:w="0" w:type="auto"/>
+            <w:vAlign w:val="center"/>
+            <w:hideMark/>
+          </w:tcPr>
+          <w:p>
+            <w:pPr>
+              <w:spacing w:after="0" w:line="240" w:lineRule="auto"/>
+              <w:rPr>
+                <w:rFonts w:ascii="Times New Roman" w:eastAsia="Times New Roman" w:hAnsi="Times New Roman" w:cs="Times New Roman"/>
+                <w:kern w:val="0"/>
+                <w:lang w:eastAsia="en-GB"/>
+                <w14:ligatures w14:val="none"/>
+              </w:rPr>
+            </w:pPr>
+            <w:proofErr w:type="spellStart"/>
+            <w:r>
+              <w:rPr>
+                <w:rFonts w:ascii="Courier New" w:eastAsia="Times New Roman" w:hAnsi="Courier New" w:cs="Courier New"/>
+                <w:kern w:val="0"/>
+                <w:sz w:val="20"/>
+                <w:szCs w:val="20"/>
+                <w:lang w:eastAsia="en-GB"/>
+                <w14:ligatures w14:val="none"/>
+              </w:rPr>
+              <w:t>habitat_id</w:t>
+            </w:r>
+            <w:proofErr w:type="spellEnd"/>
+          </w:p>
+        </w:tc>
+        <w:tc>
+          <w:tcPr>
+            <w:tcW w:w="0" w:type="auto"/>
+            <w:vAlign w:val="center"/>
+            <w:hideMark/>
+          </w:tcPr>
+          <w:p>
+            <w:pPr>
+              <w:spacing w:after="0" w:line="240" w:lineRule="auto"/>
+              <w:rPr>
+                <w:rFonts w:ascii="Times New Roman" w:eastAsia="Times New Roman" w:hAnsi="Times New Roman" w:cs="Times New Roman"/>
+                <w:kern w:val="0"/>
+                <w:lang w:eastAsia="en-GB"/>
+                <w14:ligatures w14:val="none"/>
+              </w:rPr>
+            </w:pPr>
+            <w:r>
+              <w:rPr>
+                <w:rFonts w:ascii="Times New Roman" w:eastAsia="Times New Roman" w:hAnsi="Times New Roman" w:cs="Times New Roman"/>
+                <w:kern w:val="0"/>
+                <w:lang w:eastAsia="en-GB"/>
+                <w14:ligatures w14:val="none"/>
+              </w:rPr>
+              <w:t>Foreign key</w:t>
+            </w:r>
+          </w:p>
+        </w:tc>
+      </w:tr>
+      <w:tr>
+        <w:trPr>
+          <w:tblCellSpacing w:w="15" w:type="dxa"/>
+        </w:trPr>
+        <w:tc>
+          <w:tcPr>
+            <w:tcW w:w="0" w:type="auto"/>
+            <w:vAlign w:val="center"/>
+            <w:hideMark/>
+          </w:tcPr>
+          <w:p>
+            <w:pPr>
+              <w:spacing w:after="0" w:line="240" w:lineRule="auto"/>
+              <w:rPr>
+                <w:rFonts w:ascii="Times New Roman" w:eastAsia="Times New Roman" w:hAnsi="Times New Roman" w:cs="Times New Roman"/>
+                <w:kern w:val="0"/>
+                <w:lang w:eastAsia="en-GB"/>
+                <w14:ligatures w14:val="none"/>
+              </w:rPr>
+            </w:pPr>
+            <w:r>
+              <w:rPr>
+                <w:rFonts w:ascii="Courier New" w:eastAsia="Times New Roman" w:hAnsi="Courier New" w:cs="Courier New"/>
+                <w:kern w:val="0"/>
+                <w:sz w:val="20"/>
+                <w:szCs w:val="20"/>
+                <w:lang w:eastAsia="en-GB"/>
+                <w14:ligatures w14:val="none"/>
+              </w:rPr>
+              <w:t>name</w:t>
+            </w:r>
+          </w:p>
+        </w:tc>
+        <w:tc>
+          <w:tcPr>
+            <w:tcW w:w="0" w:type="auto"/>
+            <w:vAlign w:val="center"/>
+            <w:hideMark/>
+          </w:tcPr>
+          <w:p>
+            <w:pPr>
+              <w:spacing w:after="0" w:line="240" w:lineRule="auto"/>
+              <w:rPr>
+                <w:rFonts w:ascii="Times New Roman" w:eastAsia="Times New Roman" w:hAnsi="Times New Roman" w:cs="Times New Roman"/>
+                <w:kern w:val="0"/>
+                <w:lang w:eastAsia="en-GB"/>
+                <w14:ligatures w14:val="none"/>
+              </w:rPr>
+            </w:pPr>
+            <w:r>
+              <w:rPr>
+                <w:rFonts w:ascii="Times New Roman" w:eastAsia="Times New Roman" w:hAnsi="Times New Roman" w:cs="Times New Roman"/>
+                <w:kern w:val="0"/>
+                <w:lang w:eastAsia="en-GB"/>
+                <w14:ligatures w14:val="none"/>
+              </w:rPr>
+              <w:t>Experience title</w:t>
+            </w:r>
+          </w:p>
+        </w:tc>
+      </w:tr>
+      <w:tr>
+        <w:trPr>
+          <w:tblCellSpacing w:w="15" w:type="dxa"/>
+        </w:trPr>
+        <w:tc>
+          <w:tcPr>
+            <w:tcW w:w="0" w:type="auto"/>
+            <w:vAlign w:val="center"/>
+            <w:hideMark/>
+          </w:tcPr>
+          <w:p>
+            <w:pPr>
+              <w:spacing w:after="0" w:line="240" w:lineRule="auto"/>
+              <w:rPr>
+                <w:rFonts w:ascii="Times New Roman" w:eastAsia="Times New Roman" w:hAnsi="Times New Roman" w:cs="Times New Roman"/>
+                <w:kern w:val="0"/>
+                <w:lang w:eastAsia="en-GB"/>
+                <w14:ligatures w14:val="none"/>
+              </w:rPr>
+            </w:pPr>
+            <w:r>
+              <w:rPr>
+                <w:rFonts w:ascii="Courier New" w:eastAsia="Times New Roman" w:hAnsi="Courier New" w:cs="Courier New"/>
+                <w:kern w:val="0"/>
+                <w:sz w:val="20"/>
+                <w:szCs w:val="20"/>
+                <w:lang w:eastAsia="en-GB"/>
+                <w14:ligatures w14:val="none"/>
+              </w:rPr>
+              <w:t>description</w:t>
+            </w:r>
+          </w:p>
+        </w:tc>
+        <w:tc>
+          <w:tcPr>
+            <w:tcW w:w="0" w:type="auto"/>
+            <w:vAlign w:val="center"/>
+            <w:hideMark/>
+          </w:tcPr>
+          <w:p>
+            <w:pPr>
+              <w:spacing w:after="0" w:line="240" w:lineRule="auto"/>
+              <w:rPr>
+                <w:rFonts w:ascii="Times New Roman" w:eastAsia="Times New Roman" w:hAnsi="Times New Roman" w:cs="Times New Roman"/>
+                <w:kern w:val="0"/>
+                <w:lang w:eastAsia="en-GB"/>
+                <w14:ligatures w14:val="none"/>
+              </w:rPr>
+            </w:pPr>
+            <w:r>
+              <w:rPr>
+                <w:rFonts w:ascii="Times New Roman" w:eastAsia="Times New Roman" w:hAnsi="Times New Roman" w:cs="Times New Roman"/>
+                <w:kern w:val="0"/>
+                <w:lang w:eastAsia="en-GB"/>
+                <w14:ligatures w14:val="none"/>
+              </w:rPr>
+              <w:t>Experience summary</w:t>
+            </w:r>
+          </w:p>
+        </w:tc>
+      </w:tr>
+      <w:tr>
+        <w:trPr>
+          <w:tblCellSpacing w:w="15" w:type="dxa"/>
+        </w:trPr>
+        <w:tc>
+          <w:tcPr>
+            <w:tcW w:w="0" w:type="auto"/>
+            <w:vAlign w:val="center"/>
+            <w:hideMark/>
+          </w:tcPr>
+          <w:p>
+            <w:pPr>
+              <w:spacing w:after="0" w:line="240" w:lineRule="auto"/>
+              <w:rPr>
+                <w:rFonts w:ascii="Times New Roman" w:eastAsia="Times New Roman" w:hAnsi="Times New Roman" w:cs="Times New Roman"/>
+                <w:kern w:val="0"/>
+                <w:lang w:eastAsia="en-GB"/>
+                <w14:ligatures w14:val="none"/>
+              </w:rPr>
+            </w:pPr>
+            <w:proofErr w:type="spellStart"/>
+            <w:r>
+              <w:rPr>
+                <w:rFonts w:ascii="Courier New" w:eastAsia="Times New Roman" w:hAnsi="Courier New" w:cs="Courier New"/>
+                <w:kern w:val="0"/>
+                <w:sz w:val="20"/>
+                <w:szCs w:val="20"/>
+                <w:lang w:eastAsia="en-GB"/>
+                <w14:ligatures w14:val="none"/>
+              </w:rPr>
+              <w:t>image_path</w:t>
+            </w:r>
+            <w:proofErr w:type="spellEnd"/>
+          </w:p>
+        </w:tc>
+        <w:tc>
+          <w:tcPr>
+            <w:tcW w:w="0" w:type="auto"/>
+            <w:vAlign w:val="center"/>
+            <w:hideMark/>
+          </w:tcPr>
+          <w:p>
+            <w:pPr>
+              <w:spacing w:after="0" w:line="240" w:lineRule="auto"/>
+              <w:rPr>
+                <w:rFonts w:ascii="Times New Roman" w:eastAsia="Times New Roman" w:hAnsi="Times New Roman" w:cs="Times New Roman"/>
+                <w:kern w:val="0"/>
+                <w:lang w:eastAsia="en-GB"/>
+                <w14:ligatures w14:val="none"/>
+              </w:rPr>
+            </w:pPr>
+            <w:r>
+              <w:rPr>
+                <w:rFonts w:ascii="Times New Roman" w:eastAsia="Times New Roman" w:hAnsi="Times New Roman" w:cs="Times New Roman"/>
+                <w:kern w:val="0"/>
+                <w:lang w:eastAsia="en-GB"/>
+                <w14:ligatures w14:val="none"/>
+              </w:rPr>
+              <w:t>Experience image</w:t>
+            </w:r>
+          </w:p>
+        </w:tc>
+      </w:tr>
+      <w:tr>
+        <w:trPr>
+          <w:tblCellSpacing w:w="15" w:type="dxa"/>
+        </w:trPr>
+        <w:tc>
+          <w:tcPr>
+            <w:tcW w:w="0" w:type="auto"/>
+            <w:vAlign w:val="center"/>
+            <w:hideMark/>
+          </w:tcPr>
+          <w:p>
+            <w:pPr>
+              <w:spacing w:after="0" w:line="240" w:lineRule="auto"/>
+              <w:rPr>
+                <w:rFonts w:ascii="Times New Roman" w:eastAsia="Times New Roman" w:hAnsi="Times New Roman" w:cs="Times New Roman"/>
+                <w:kern w:val="0"/>
+                <w:lang w:eastAsia="en-GB"/>
+                <w14:ligatures w14:val="none"/>
+              </w:rPr>
+            </w:pPr>
+            <w:r>
+              <w:rPr>
+                <w:rFonts w:ascii="Courier New" w:eastAsia="Times New Roman" w:hAnsi="Courier New" w:cs="Courier New"/>
+                <w:kern w:val="0"/>
+                <w:sz w:val="20"/>
+                <w:szCs w:val="20"/>
+                <w:lang w:eastAsia="en-GB"/>
+                <w14:ligatures w14:val="none"/>
+              </w:rPr>
+              <w:t>duration</w:t>
+            </w:r>
+          </w:p>
+        </w:tc>
+        <w:tc>
+          <w:tcPr>
+            <w:tcW w:w="0" w:type="auto"/>
+            <w:vAlign w:val="center"/>
+            <w:hideMark/>
+          </w:tcPr>
+          <w:p>
+            <w:pPr>
+              <w:spacing w:after="0" w:line="240" w:lineRule="auto"/>
+              <w:rPr>
+                <w:rFonts w:ascii="Times New Roman" w:eastAsia="Times New Roman" w:hAnsi="Times New Roman" w:cs="Times New Roman"/>
+                <w:kern w:val="0"/>
+                <w:lang w:eastAsia="en-GB"/>
+                <w14:ligatures w14:val="none"/>
+              </w:rPr>
+            </w:pPr>
+            <w:r>
+              <w:rPr>
+                <w:rFonts w:ascii="Times New Roman" w:eastAsia="Times New Roman" w:hAnsi="Times New Roman" w:cs="Times New Roman"/>
+                <w:kern w:val="0"/>
+                <w:lang w:eastAsia="en-GB"/>
+                <w14:ligatures w14:val="none"/>
+              </w:rPr>
+              <w:t>Visit duration</w:t>
+            </w:r>
+          </w:p>
+        </w:tc>
+      </w:tr>
+    </w:tbl>
     <w:p>
       <w:pPr>
         <w:pStyle w:val="HTMLPreformatted"/>
@@ -2242,7 +4277,6 @@
     <w:next w:val="Normal"/>
     <w:link w:val="Heading3Char"/>
     <w:uiPriority w:val="9"/>
-    <w:semiHidden/>
     <w:unhideWhenUsed/>
     <w:qFormat/>
     <w:rsid w:val="00C877E0"/>
@@ -2449,7 +4483,6 @@
     <w:basedOn w:val="DefaultParagraphFont"/>
     <w:link w:val="Heading3"/>
     <w:uiPriority w:val="9"/>
-    <w:semiHidden/>
     <w:rsid w:val="00C877E0"/>
     <w:rPr>
       <w:rFonts w:eastAsiaTheme="majorEastAsia" w:cstheme="majorBidi"/>

</xml_diff>